<commit_message>
India profile: reputable sources only, trimmed to house length, competitor table
Wikipedia replaced with official and established sources; uncited sentences
sourced or cut; competitive landscape restructured as who-is-doing-what entries.
Changes independently re-checked (7 fixes). Skill records length caps and the
entries structure for future profiles.

Co-Authored-By: Claude Opus 5.5 <noreply@anthropic.com>
Claude-Session: https://claude.ai/code/session_01ChEN58PbdXFZmwUoBZYBRb
</commit_message>
<xml_diff>
--- a/output/India_Profile_DRAFT_SOURCES.docx
+++ b/output/India_Profile_DRAFT_SOURCES.docx
@@ -57,14 +57,14 @@
         <w:tab/>
       </w:r>
       <w:r>
-        <w:t xml:space="preserve">Wikipedia contributors. “India.” Wikipedia. </w:t>
+        <w:t xml:space="preserve">Embassy of India, Khartoum. “India at a Glance.” Ministry of External Affairs, Government of India. </w:t>
       </w:r>
       <w:hyperlink r:id="rId10">
         <w:r>
           <w:rPr>
             <w:color w:val="1F4E99"/>
           </w:rPr>
-          <w:t xml:space="preserve">https://en.wikipedia.org/wiki/India</w:t>
+          <w:t xml:space="preserve">https://www.eoikhartoum.gov.in/india-at-a-glance.php</w:t>
         </w:r>
       </w:hyperlink>
     </w:p>
@@ -85,9 +85,37 @@
         <w:tab/>
       </w:r>
       <w:r>
+        <w:t xml:space="preserve">Legislative Department, Ministry of Law and Justice, Government of India. “The Constitution of India (as on 1st May, 2024).” Legislative Department, 1 May 2024. </w:t>
+      </w:r>
+      <w:hyperlink r:id="rId11">
+        <w:r>
+          <w:rPr>
+            <w:color w:val="1F4E99"/>
+          </w:rPr>
+          <w:t xml:space="preserve">https://cdnbbsr.s3waas.gov.in/s380537a945c7aaa788ccfcdf1b99b5d8f/uploads/2024/07/20240716890312078.pdf</w:t>
+        </w:r>
+      </w:hyperlink>
+    </w:p>
+    <w:p>
+      <w:pPr>
+        <w:tabs>
+          <w:tab w:pos="567" w:val="left"/>
+        </w:tabs>
+        <w:spacing w:after="120"/>
+        <w:ind w:left="567" w:hanging="567"/>
+      </w:pPr>
+      <w:r>
+        <w:rPr>
+          <w:b/>
+          <w:color w:val="B31822"/>
+        </w:rPr>
+        <w:t>3.</w:t>
+        <w:tab/>
+      </w:r>
+      <w:r>
         <w:t xml:space="preserve">Business Standard. “India's population estimated to hit 1.46 billion in 2025 says UN.” 10 June 2025. </w:t>
       </w:r>
-      <w:hyperlink r:id="rId11">
+      <w:hyperlink r:id="rId12">
         <w:r>
           <w:rPr>
             <w:color w:val="1F4E99"/>
@@ -109,13 +137,13 @@
           <w:b/>
           <w:color w:val="B31822"/>
         </w:rPr>
-        <w:t>3.</w:t>
+        <w:t>4.</w:t>
         <w:tab/>
       </w:r>
       <w:r>
         <w:t xml:space="preserve">United Nations Population Fund. “World Population Dashboard: India.” </w:t>
       </w:r>
-      <w:hyperlink r:id="rId12">
+      <w:hyperlink r:id="rId13">
         <w:r>
           <w:rPr>
             <w:color w:val="1F4E99"/>
@@ -137,13 +165,13 @@
           <w:b/>
           <w:color w:val="B31822"/>
         </w:rPr>
-        <w:t>4.</w:t>
+        <w:t>5.</w:t>
         <w:tab/>
       </w:r>
       <w:r>
         <w:t xml:space="preserve">World Bank. “GDP, PPP (current international $), India.” World Bank Open Data. </w:t>
       </w:r>
-      <w:hyperlink r:id="rId13">
+      <w:hyperlink r:id="rId14">
         <w:r>
           <w:rPr>
             <w:color w:val="1F4E99"/>
@@ -165,13 +193,13 @@
           <w:b/>
           <w:color w:val="B31822"/>
         </w:rPr>
-        <w:t>5.</w:t>
+        <w:t>6.</w:t>
         <w:tab/>
       </w:r>
       <w:r>
         <w:t xml:space="preserve">World Bank. “World Development Indicators API: GDP, PPP (current international $), India (NY.GDP.MKTP.PP.CD).” World Bank Indicators API, 13 July 2026. </w:t>
       </w:r>
-      <w:hyperlink r:id="rId14">
+      <w:hyperlink r:id="rId15">
         <w:r>
           <w:rPr>
             <w:color w:val="1F4E99"/>
@@ -193,13 +221,13 @@
           <w:b/>
           <w:color w:val="B31822"/>
         </w:rPr>
-        <w:t>6.</w:t>
+        <w:t>7.</w:t>
         <w:tab/>
       </w:r>
       <w:r>
         <w:t xml:space="preserve">World Bank. “GDP per capita, PPP (current international $), India.” World Bank Open Data. </w:t>
       </w:r>
-      <w:hyperlink r:id="rId15">
+      <w:hyperlink r:id="rId16">
         <w:r>
           <w:rPr>
             <w:color w:val="1F4E99"/>
@@ -221,18 +249,18 @@
           <w:b/>
           <w:color w:val="B31822"/>
         </w:rPr>
-        <w:t>7.</w:t>
+        <w:t>8.</w:t>
         <w:tab/>
       </w:r>
       <w:r>
-        <w:t xml:space="preserve">Wikipedia contributors. “Presidency of Droupadi Murmu.” Wikipedia. </w:t>
-      </w:r>
-      <w:hyperlink r:id="rId16">
+        <w:t xml:space="preserve">President's Secretariat, Government of India. “Profile of the President.” President of India. </w:t>
+      </w:r>
+      <w:hyperlink r:id="rId17">
         <w:r>
           <w:rPr>
             <w:color w:val="1F4E99"/>
           </w:rPr>
-          <w:t xml:space="preserve">https://en.wikipedia.org/wiki/Presidency_of_Droupadi_Murmu</w:t>
+          <w:t xml:space="preserve">https://www.presidentofindia.gov.in/Profile</w:t>
         </w:r>
       </w:hyperlink>
     </w:p>
@@ -249,13 +277,69 @@
           <w:b/>
           <w:color w:val="B31822"/>
         </w:rPr>
-        <w:t>8.</w:t>
+        <w:t>9.</w:t>
         <w:tab/>
       </w:r>
       <w:r>
+        <w:t xml:space="preserve">Prime Minister's Office, Government of India. “Know the PM.” PM India. </w:t>
+      </w:r>
+      <w:hyperlink r:id="rId18">
+        <w:r>
+          <w:rPr>
+            <w:color w:val="1F4E99"/>
+          </w:rPr>
+          <w:t xml:space="preserve">https://www.pmindia.gov.in/en/pms-profile/</w:t>
+        </w:r>
+      </w:hyperlink>
+    </w:p>
+    <w:p>
+      <w:pPr>
+        <w:tabs>
+          <w:tab w:pos="567" w:val="left"/>
+        </w:tabs>
+        <w:spacing w:after="120"/>
+        <w:ind w:left="567" w:hanging="567"/>
+      </w:pPr>
+      <w:r>
+        <w:rPr>
+          <w:b/>
+          <w:color w:val="B31822"/>
+        </w:rPr>
+        <w:t>10.</w:t>
+        <w:tab/>
+      </w:r>
+      <w:r>
+        <w:t xml:space="preserve">Reserve Bank of India. “Indian Currency (FAQs, updated as on April 15, 2025).” Reserve Bank of India, 15 April 2025. </w:t>
+      </w:r>
+      <w:hyperlink r:id="rId19">
+        <w:r>
+          <w:rPr>
+            <w:color w:val="1F4E99"/>
+          </w:rPr>
+          <w:t xml:space="preserve">https://www.rbi.org.in/commonman/Upload/English/FAQs/PDFs/INDIANCURRENCY15042025.pdf</w:t>
+        </w:r>
+      </w:hyperlink>
+    </w:p>
+    <w:p>
+      <w:pPr>
+        <w:tabs>
+          <w:tab w:pos="567" w:val="left"/>
+        </w:tabs>
+        <w:spacing w:after="120"/>
+        <w:ind w:left="567" w:hanging="567"/>
+      </w:pPr>
+      <w:r>
+        <w:rPr>
+          <w:b/>
+          <w:color w:val="B31822"/>
+        </w:rPr>
+        <w:t>11.</w:t>
+        <w:tab/>
+      </w:r>
+      <w:r>
         <w:t xml:space="preserve">World Bank. “Urban population (% of total population), India.” World Bank Open Data. </w:t>
       </w:r>
-      <w:hyperlink r:id="rId17">
+      <w:hyperlink r:id="rId20">
         <w:r>
           <w:rPr>
             <w:color w:val="1F4E99"/>
@@ -277,13 +361,13 @@
           <w:b/>
           <w:color w:val="B31822"/>
         </w:rPr>
-        <w:t>9.</w:t>
+        <w:t>12.</w:t>
         <w:tab/>
       </w:r>
       <w:r>
         <w:t xml:space="preserve">The Wire. “All States Except Six in North India are Below Replacement Fertility Levels, Govt Report Suggests.” 24 May 2026. </w:t>
       </w:r>
-      <w:hyperlink r:id="rId18">
+      <w:hyperlink r:id="rId21">
         <w:r>
           <w:rPr>
             <w:color w:val="1F4E99"/>
@@ -305,13 +389,13 @@
           <w:b/>
           <w:color w:val="B31822"/>
         </w:rPr>
-        <w:t>10.</w:t>
+        <w:t>13.</w:t>
         <w:tab/>
       </w:r>
       <w:r>
         <w:t xml:space="preserve">The Policy Edge. “India's Fertility Falls Below Replacement Level in SRS 2024 Demographic Report.” 23 May 2026. </w:t>
       </w:r>
-      <w:hyperlink r:id="rId19">
+      <w:hyperlink r:id="rId22">
         <w:r>
           <w:rPr>
             <w:color w:val="1F4E99"/>
@@ -333,13 +417,13 @@
           <w:b/>
           <w:color w:val="B31822"/>
         </w:rPr>
-        <w:t>11.</w:t>
+        <w:t>14.</w:t>
         <w:tab/>
       </w:r>
       <w:r>
         <w:t xml:space="preserve">Business Standard. “Amid delimitation row, SRS bulletin reveals population imbalance in India.” 24 May 2026. </w:t>
       </w:r>
-      <w:hyperlink r:id="rId20">
+      <w:hyperlink r:id="rId23">
         <w:r>
           <w:rPr>
             <w:color w:val="1F4E99"/>
@@ -361,13 +445,13 @@
           <w:b/>
           <w:color w:val="B31822"/>
         </w:rPr>
-        <w:t>12.</w:t>
+        <w:t>15.</w:t>
         <w:tab/>
       </w:r>
       <w:r>
         <w:t xml:space="preserve">UNFPA India. “India ageing, elderly to make up 20% of population by 2050: UNFPA report.” 27 September 2023. </w:t>
       </w:r>
-      <w:hyperlink r:id="rId21">
+      <w:hyperlink r:id="rId24">
         <w:r>
           <w:rPr>
             <w:color w:val="1F4E99"/>
@@ -389,13 +473,13 @@
           <w:b/>
           <w:color w:val="B31822"/>
         </w:rPr>
-        <w:t>13.</w:t>
+        <w:t>16.</w:t>
         <w:tab/>
       </w:r>
       <w:r>
         <w:t xml:space="preserve">Factly. “Data: 'India Ageing Report 2023' Highlights Challenges of Demographic Shift.” 13 October 2023. </w:t>
       </w:r>
-      <w:hyperlink r:id="rId22">
+      <w:hyperlink r:id="rId25">
         <w:r>
           <w:rPr>
             <w:color w:val="1F4E99"/>
@@ -417,13 +501,41 @@
           <w:b/>
           <w:color w:val="B31822"/>
         </w:rPr>
-        <w:t>14.</w:t>
+        <w:t>17.</w:t>
         <w:tab/>
       </w:r>
       <w:r>
+        <w:t xml:space="preserve">Press Trust of India. “India's population to peak in early 2060s to 1.7 billion before declining: United Nations.” The Tribune, 12 July 2024. </w:t>
+      </w:r>
+      <w:hyperlink r:id="rId26">
+        <w:r>
+          <w:rPr>
+            <w:color w:val="1F4E99"/>
+          </w:rPr>
+          <w:t xml:space="preserve">https://www.tribuneindia.com/news/india/indias-population-to-peak-in-early-2060s-to-1-7-billion-before-declining-un-639130/</w:t>
+        </w:r>
+      </w:hyperlink>
+    </w:p>
+    <w:p>
+      <w:pPr>
+        <w:tabs>
+          <w:tab w:pos="567" w:val="left"/>
+        </w:tabs>
+        <w:spacing w:after="120"/>
+        <w:ind w:left="567" w:hanging="567"/>
+      </w:pPr>
+      <w:r>
+        <w:rPr>
+          <w:b/>
+          <w:color w:val="B31822"/>
+        </w:rPr>
+        <w:t>18.</w:t>
+        <w:tab/>
+      </w:r>
+      <w:r>
         <w:t xml:space="preserve">Press Information Bureau, Government of India. “Registrar General and Census Commissioner of India addresses Press Conference on Census-2027, in New Delhi today.” 30 March 2026. </w:t>
       </w:r>
-      <w:hyperlink r:id="rId23">
+      <w:hyperlink r:id="rId27">
         <w:r>
           <w:rPr>
             <w:color w:val="1F4E99"/>
@@ -445,97 +557,13 @@
           <w:b/>
           <w:color w:val="B31822"/>
         </w:rPr>
-        <w:t>15.</w:t>
+        <w:t>19.</w:t>
         <w:tab/>
       </w:r>
       <w:r>
-        <w:t xml:space="preserve">Wikipedia contributors. “2027 census of India.” Wikipedia. </w:t>
-      </w:r>
-      <w:hyperlink r:id="rId24">
-        <w:r>
-          <w:rPr>
-            <w:color w:val="1F4E99"/>
-          </w:rPr>
-          <w:t xml:space="preserve">https://en.wikipedia.org/wiki/2027_census_of_India</w:t>
-        </w:r>
-      </w:hyperlink>
-    </w:p>
-    <w:p>
-      <w:pPr>
-        <w:tabs>
-          <w:tab w:pos="567" w:val="left"/>
-        </w:tabs>
-        <w:spacing w:after="120"/>
-        <w:ind w:left="567" w:hanging="567"/>
-      </w:pPr>
-      <w:r>
-        <w:rPr>
-          <w:b/>
-          <w:color w:val="B31822"/>
-        </w:rPr>
-        <w:t>16.</w:t>
-        <w:tab/>
-      </w:r>
-      <w:r>
-        <w:t xml:space="preserve">Wikipedia contributors. “Seventh Schedule to the Constitution of India.” Wikipedia. </w:t>
-      </w:r>
-      <w:hyperlink r:id="rId25">
-        <w:r>
-          <w:rPr>
-            <w:color w:val="1F4E99"/>
-          </w:rPr>
-          <w:t xml:space="preserve">https://en.wikipedia.org/wiki/Seventh_Schedule_to_the_Constitution_of_India</w:t>
-        </w:r>
-      </w:hyperlink>
-    </w:p>
-    <w:p>
-      <w:pPr>
-        <w:tabs>
-          <w:tab w:pos="567" w:val="left"/>
-        </w:tabs>
-        <w:spacing w:after="120"/>
-        <w:ind w:left="567" w:hanging="567"/>
-      </w:pPr>
-      <w:r>
-        <w:rPr>
-          <w:b/>
-          <w:color w:val="B31822"/>
-        </w:rPr>
-        <w:t>17.</w:t>
-        <w:tab/>
-      </w:r>
-      <w:r>
-        <w:t xml:space="preserve">Prepp. “"Public health and sanitation; hospitals and dispensaries" is listed in the ________ list given in the Seventh Schedule in the Constitution of India.” </w:t>
-      </w:r>
-      <w:hyperlink r:id="rId26">
-        <w:r>
-          <w:rPr>
-            <w:color w:val="1F4E99"/>
-          </w:rPr>
-          <w:t xml:space="preserve">https://prepp.in/question/public-health-and-sanitation-hospitals-and-dispen-645ddd980ea67d595b114597</w:t>
-        </w:r>
-      </w:hyperlink>
-    </w:p>
-    <w:p>
-      <w:pPr>
-        <w:tabs>
-          <w:tab w:pos="567" w:val="left"/>
-        </w:tabs>
-        <w:spacing w:after="120"/>
-        <w:ind w:left="567" w:hanging="567"/>
-      </w:pPr>
-      <w:r>
-        <w:rPr>
-          <w:b/>
-          <w:color w:val="B31822"/>
-        </w:rPr>
-        <w:t>18.</w:t>
-        <w:tab/>
-      </w:r>
-      <w:r>
         <w:t xml:space="preserve">Ministry of Health and Family Welfare, Government of India. “Technical &amp; Operational Guidelines: Implementation of 15th Finance Commission (FC-XV) Health Grants through Local Governments.” National Health Systems Resource Centre, 31 August 2021. </w:t>
       </w:r>
-      <w:hyperlink r:id="rId27">
+      <w:hyperlink r:id="rId28">
         <w:r>
           <w:rPr>
             <w:color w:val="1F4E99"/>
@@ -557,13 +585,13 @@
           <w:b/>
           <w:color w:val="B31822"/>
         </w:rPr>
-        <w:t>19.</w:t>
+        <w:t>20.</w:t>
         <w:tab/>
       </w:r>
       <w:r>
         <w:t xml:space="preserve">Akashvani News. “Odisha becomes 34th State/UT to implement Ayushman Bharat PM-JAY.” News On AIR, 14 January 2025. </w:t>
       </w:r>
-      <w:hyperlink r:id="rId28">
+      <w:hyperlink r:id="rId29">
         <w:r>
           <w:rPr>
             <w:color w:val="1F4E99"/>
@@ -585,13 +613,13 @@
           <w:b/>
           <w:color w:val="B31822"/>
         </w:rPr>
-        <w:t>20.</w:t>
+        <w:t>21.</w:t>
         <w:tab/>
       </w:r>
       <w:r>
         <w:t xml:space="preserve">Deccan Herald. “Delhi govt inks MoU with Centre to roll out Ayushman Bharat scheme.” 5 April 2025. </w:t>
       </w:r>
-      <w:hyperlink r:id="rId29">
+      <w:hyperlink r:id="rId30">
         <w:r>
           <w:rPr>
             <w:color w:val="1F4E99"/>
@@ -613,13 +641,13 @@
           <w:b/>
           <w:color w:val="B31822"/>
         </w:rPr>
-        <w:t>21.</w:t>
+        <w:t>22.</w:t>
         <w:tab/>
       </w:r>
       <w:r>
         <w:t xml:space="preserve">Press Information Bureau, Government of India. “West Bengal Becomes 36th State/UT to Implement Ayushman Bharat PM-JAY.” 8 June 2026. </w:t>
       </w:r>
-      <w:hyperlink r:id="rId30">
+      <w:hyperlink r:id="rId31">
         <w:r>
           <w:rPr>
             <w:color w:val="1F4E99"/>
@@ -641,13 +669,41 @@
           <w:b/>
           <w:color w:val="B31822"/>
         </w:rPr>
-        <w:t>22.</w:t>
+        <w:t>23.</w:t>
         <w:tab/>
       </w:r>
       <w:r>
+        <w:t xml:space="preserve">National Health Accounts Technical Secretariat, National Health Systems Resource Centre, Ministry of Health and Family Welfare, Government of India. “National Health Accounts Estimates for India 2022-23.” 2026. </w:t>
+      </w:r>
+      <w:hyperlink r:id="rId32">
+        <w:r>
+          <w:rPr>
+            <w:color w:val="1F4E99"/>
+          </w:rPr>
+          <w:t xml:space="preserve">https://nhsrcindia.org/sites/default/files/2026-05/NHA%202022-23%20Report.pdf</w:t>
+        </w:r>
+      </w:hyperlink>
+    </w:p>
+    <w:p>
+      <w:pPr>
+        <w:tabs>
+          <w:tab w:pos="567" w:val="left"/>
+        </w:tabs>
+        <w:spacing w:after="120"/>
+        <w:ind w:left="567" w:hanging="567"/>
+      </w:pPr>
+      <w:r>
+        <w:rPr>
+          <w:b/>
+          <w:color w:val="B31822"/>
+        </w:rPr>
+        <w:t>24.</w:t>
+        <w:tab/>
+      </w:r>
+      <w:r>
         <w:t xml:space="preserve">Free Press Journal. “Maharashtra Signs MoU With Cleveland Clinic And Brookfield For Navi Mumbai International MediCity, India's First Global-Scale Healthcare Hub.” 11 June 2026. </w:t>
       </w:r>
-      <w:hyperlink r:id="rId31">
+      <w:hyperlink r:id="rId33">
         <w:r>
           <w:rPr>
             <w:color w:val="1F4E99"/>
@@ -669,13 +725,41 @@
           <w:b/>
           <w:color w:val="B31822"/>
         </w:rPr>
-        <w:t>23.</w:t>
+        <w:t>25.</w:t>
         <w:tab/>
       </w:r>
       <w:r>
+        <w:t xml:space="preserve">International Monetary Fund. “World Economic Outlook Update, July 2026: Global Economy in Crosscurrents of War and Technology.” International Monetary Fund, 8 July 2026. </w:t>
+      </w:r>
+      <w:hyperlink r:id="rId34">
+        <w:r>
+          <w:rPr>
+            <w:color w:val="1F4E99"/>
+          </w:rPr>
+          <w:t xml:space="preserve">https://www.imf.org/-/media/files/publications/weo/2026/update/july/english/text.pdf</w:t>
+        </w:r>
+      </w:hyperlink>
+    </w:p>
+    <w:p>
+      <w:pPr>
+        <w:tabs>
+          <w:tab w:pos="567" w:val="left"/>
+        </w:tabs>
+        <w:spacing w:after="120"/>
+        <w:ind w:left="567" w:hanging="567"/>
+      </w:pPr>
+      <w:r>
+        <w:rPr>
+          <w:b/>
+          <w:color w:val="B31822"/>
+        </w:rPr>
+        <w:t>26.</w:t>
+        <w:tab/>
+      </w:r>
+      <w:r>
         <w:t xml:space="preserve">National Statistics Office, Ministry of Statistics and Programme Implementation, Government of India. “Press Note on Provisional Estimates of Annual Gross Domestic Product for 2025-26 and Quarterly Estimates of Gross Domestic Product for the Fourth Quarter (January-March) of 2025-26.” 5 June 2026. </w:t>
       </w:r>
-      <w:hyperlink r:id="rId32">
+      <w:hyperlink r:id="rId35">
         <w:r>
           <w:rPr>
             <w:color w:val="1F4E99"/>
@@ -697,13 +781,13 @@
           <w:b/>
           <w:color w:val="B31822"/>
         </w:rPr>
-        <w:t>24.</w:t>
+        <w:t>27.</w:t>
         <w:tab/>
       </w:r>
       <w:r>
         <w:t xml:space="preserve">National Statistics Office, Ministry of Statistics and Programme Implementation, Government of India. “Press Note on Quarterly Estimates of Gross Domestic Product for the First Quarter (April-June) of 2026-27.” 31 August 2026. </w:t>
       </w:r>
-      <w:hyperlink r:id="rId33">
+      <w:hyperlink r:id="rId36">
         <w:r>
           <w:rPr>
             <w:color w:val="1F4E99"/>
@@ -725,102 +809,18 @@
           <w:b/>
           <w:color w:val="B31822"/>
         </w:rPr>
-        <w:t>25.</w:t>
+        <w:t>28.</w:t>
         <w:tab/>
       </w:r>
       <w:r>
-        <w:t xml:space="preserve">National Statistics Office, Ministry of Statistics and Programme Implementation, Government of India. “Press Note on New Series of GDP Estimates with Base Year 2022-23.” 27 February 2026. </w:t>
-      </w:r>
-      <w:hyperlink r:id="rId34">
-        <w:r>
-          <w:rPr>
-            <w:color w:val="1F4E99"/>
-          </w:rPr>
-          <w:t xml:space="preserve">https://www.mospi.gov.in/uploads/latestReleases/latest_release_1772189865181_f040336d-bc57-4aed-b80f-586d9ccb279e_Press_Note_on_New_Series_of_GDP_Estimates_with_Base_Year_2022-23_27022026.pdf</w:t>
-        </w:r>
-      </w:hyperlink>
-    </w:p>
-    <w:p>
-      <w:pPr>
-        <w:tabs>
-          <w:tab w:pos="567" w:val="left"/>
-        </w:tabs>
-        <w:spacing w:after="120"/>
-        <w:ind w:left="567" w:hanging="567"/>
-      </w:pPr>
-      <w:r>
-        <w:rPr>
-          <w:b/>
-          <w:color w:val="B31822"/>
-        </w:rPr>
-        <w:t>26.</w:t>
-        <w:tab/>
-      </w:r>
-      <w:r>
         <w:t xml:space="preserve">Al Jazeera. “US hikes India tariffs to 50 percent over Russian oil purchases.” 27 August 2025. </w:t>
       </w:r>
-      <w:hyperlink r:id="rId35">
+      <w:hyperlink r:id="rId37">
         <w:r>
           <w:rPr>
             <w:color w:val="1F4E99"/>
           </w:rPr>
           <w:t xml:space="preserve">https://www.aljazeera.com/news/2025/8/27/us-imposes-50-percent-tariff-on-india-over-russian-oil-purchases</w:t>
-        </w:r>
-      </w:hyperlink>
-    </w:p>
-    <w:p>
-      <w:pPr>
-        <w:tabs>
-          <w:tab w:pos="567" w:val="left"/>
-        </w:tabs>
-        <w:spacing w:after="120"/>
-        <w:ind w:left="567" w:hanging="567"/>
-      </w:pPr>
-      <w:r>
-        <w:rPr>
-          <w:b/>
-          <w:color w:val="B31822"/>
-        </w:rPr>
-        <w:t>27.</w:t>
-        <w:tab/>
-      </w:r>
-      <w:r>
-        <w:t xml:space="preserve">The White House. “United States-India Joint Statement.” 6 February 2026. </w:t>
-      </w:r>
-      <w:hyperlink r:id="rId36">
-        <w:r>
-          <w:rPr>
-            <w:color w:val="1F4E99"/>
-          </w:rPr>
-          <w:t xml:space="preserve">https://www.whitehouse.gov/briefings-statements/2026/02/united-states-india-joint-statement/</w:t>
-        </w:r>
-      </w:hyperlink>
-    </w:p>
-    <w:p>
-      <w:pPr>
-        <w:tabs>
-          <w:tab w:pos="567" w:val="left"/>
-        </w:tabs>
-        <w:spacing w:after="120"/>
-        <w:ind w:left="567" w:hanging="567"/>
-      </w:pPr>
-      <w:r>
-        <w:rPr>
-          <w:b/>
-          <w:color w:val="B31822"/>
-        </w:rPr>
-        <w:t>28.</w:t>
-        <w:tab/>
-      </w:r>
-      <w:r>
-        <w:t xml:space="preserve">India Briefing. “What's in the India-US Trade Deal? Tariffs and Import Targets.” 6 February 2026. </w:t>
-      </w:r>
-      <w:hyperlink r:id="rId37">
-        <w:r>
-          <w:rPr>
-            <w:color w:val="1F4E99"/>
-          </w:rPr>
-          <w:t xml:space="preserve">https://www.india-briefing.com/news/india-us-trade-deal-tariff-cuts-timeline-42471.html/</w:t>
         </w:r>
       </w:hyperlink>
     </w:p>
@@ -1429,37 +1429,9 @@
         <w:tab/>
       </w:r>
       <w:r>
-        <w:t xml:space="preserve">Think Global Health. “India's Call for Action on Noncommunicable Diseases.” Council on Foreign Relations, 3 July 2024. </w:t>
+        <w:t xml:space="preserve">GBD 2021 Risk Factors Collaborators. “Global burden and strength of evidence for 88 risk factors in 204 countries and 811 subnational locations, 1990-2021: a systematic analysis for the Global Burden of Disease Study 2021.” The Lancet, 2024. </w:t>
       </w:r>
       <w:hyperlink r:id="rId59">
-        <w:r>
-          <w:rPr>
-            <w:color w:val="1F4E99"/>
-          </w:rPr>
-          <w:t xml:space="preserve">https://www.thinkglobalhealth.org/article/indias-call-action-noncommunicable-diseases</w:t>
-        </w:r>
-      </w:hyperlink>
-    </w:p>
-    <w:p>
-      <w:pPr>
-        <w:tabs>
-          <w:tab w:pos="567" w:val="left"/>
-        </w:tabs>
-        <w:spacing w:after="120"/>
-        <w:ind w:left="567" w:hanging="567"/>
-      </w:pPr>
-      <w:r>
-        <w:rPr>
-          <w:b/>
-          <w:color w:val="B31822"/>
-        </w:rPr>
-        <w:t>51.</w:t>
-        <w:tab/>
-      </w:r>
-      <w:r>
-        <w:t xml:space="preserve">GBD 2021 Risk Factors Collaborators. “Global burden and strength of evidence for 88 risk factors in 204 countries and 811 subnational locations, 1990-2021: a systematic analysis for the Global Burden of Disease Study 2021.” The Lancet, 2024. </w:t>
-      </w:r>
-      <w:hyperlink r:id="rId60">
         <w:r>
           <w:rPr>
             <w:color w:val="1F4E99"/>
@@ -1481,13 +1453,13 @@
           <w:b/>
           <w:color w:val="B31822"/>
         </w:rPr>
-        <w:t>52.</w:t>
+        <w:t>51.</w:t>
         <w:tab/>
       </w:r>
       <w:r>
         <w:t xml:space="preserve">Behera DK, Rahut DB, Mishra S, et al. “Analyzing stroke burden and risk factors in India using data from the Global Burden of Disease Study.” Scientific Reports, 30 September 2024. </w:t>
       </w:r>
-      <w:hyperlink r:id="rId61">
+      <w:hyperlink r:id="rId60">
         <w:r>
           <w:rPr>
             <w:color w:val="1F4E99"/>
@@ -1509,13 +1481,13 @@
           <w:b/>
           <w:color w:val="B31822"/>
         </w:rPr>
-        <w:t>53.</w:t>
+        <w:t>52.</w:t>
         <w:tab/>
       </w:r>
       <w:r>
         <w:t xml:space="preserve">Business Standard. “874,000 cancer deaths in India in 2024: ICMR analysis reveals rising crisis.” 26 August 2025. </w:t>
       </w:r>
-      <w:hyperlink r:id="rId62">
+      <w:hyperlink r:id="rId61">
         <w:r>
           <w:rPr>
             <w:color w:val="1F4E99"/>
@@ -1537,41 +1509,13 @@
           <w:b/>
           <w:color w:val="B31822"/>
         </w:rPr>
-        <w:t>54.</w:t>
+        <w:t>53.</w:t>
         <w:tab/>
       </w:r>
       <w:r>
-        <w:t xml:space="preserve">Press Information Bureau, Government of India. “Update on "75/25" Initiative.” 11 March 2025. </w:t>
-      </w:r>
-      <w:hyperlink r:id="rId63">
-        <w:r>
-          <w:rPr>
-            <w:color w:val="1F4E99"/>
-          </w:rPr>
-          <w:t xml:space="preserve">https://www.pib.gov.in/PressReleasePage.aspx?PRID=2110390</w:t>
-        </w:r>
-      </w:hyperlink>
-    </w:p>
-    <w:p>
-      <w:pPr>
-        <w:tabs>
-          <w:tab w:pos="567" w:val="left"/>
-        </w:tabs>
-        <w:spacing w:after="120"/>
-        <w:ind w:left="567" w:hanging="567"/>
-      </w:pPr>
-      <w:r>
-        <w:rPr>
-          <w:b/>
-          <w:color w:val="B31822"/>
-        </w:rPr>
-        <w:t>55.</w:t>
-        <w:tab/>
-      </w:r>
-      <w:r>
         <w:t xml:space="preserve">Press Information Bureau, Government of India. “Initiatives &amp; Achievements-2025 (Ministry of Health and Family Welfare).” 1 January 2026. </w:t>
       </w:r>
-      <w:hyperlink r:id="rId64">
+      <w:hyperlink r:id="rId62">
         <w:r>
           <w:rPr>
             <w:color w:val="1F4E99"/>
@@ -1593,13 +1537,13 @@
           <w:b/>
           <w:color w:val="B31822"/>
         </w:rPr>
-        <w:t>56.</w:t>
+        <w:t>54.</w:t>
         <w:tab/>
       </w:r>
       <w:r>
         <w:t xml:space="preserve">Press Information Bureau, Government of India. “Update on Ayushman Arogya Mandir.” 1 August 2025. </w:t>
       </w:r>
-      <w:hyperlink r:id="rId65">
+      <w:hyperlink r:id="rId63">
         <w:r>
           <w:rPr>
             <w:color w:val="1F4E99"/>
@@ -1621,13 +1565,13 @@
           <w:b/>
           <w:color w:val="B31822"/>
         </w:rPr>
-        <w:t>57.</w:t>
+        <w:t>55.</w:t>
         <w:tab/>
       </w:r>
       <w:r>
         <w:t xml:space="preserve">Press Information Bureau, Government of India. “Status of Expenditure on Healthcare Infrastructure.” 3 December 2024. </w:t>
       </w:r>
-      <w:hyperlink r:id="rId66">
+      <w:hyperlink r:id="rId64">
         <w:r>
           <w:rPr>
             <w:color w:val="1F4E99"/>
@@ -1649,13 +1593,13 @@
           <w:b/>
           <w:color w:val="B31822"/>
         </w:rPr>
-        <w:t>58.</w:t>
+        <w:t>56.</w:t>
         <w:tab/>
       </w:r>
       <w:r>
         <w:t xml:space="preserve">ANI. “'Sankalp for Seva': JP Nadda marks 8 years of Ayushman Bharat PM-JAY, highlights coverage of over 60 crore people.” 23 September 2026. </w:t>
       </w:r>
-      <w:hyperlink r:id="rId67">
+      <w:hyperlink r:id="rId65">
         <w:r>
           <w:rPr>
             <w:color w:val="1F4E99"/>
@@ -1677,13 +1621,13 @@
           <w:b/>
           <w:color w:val="B31822"/>
         </w:rPr>
-        <w:t>59.</w:t>
+        <w:t>57.</w:t>
         <w:tab/>
       </w:r>
       <w:r>
         <w:t xml:space="preserve">IANS. “India's AB PM-JAY marks 8th anniversary, funds 13.25 crore admissions.” Morung Express, 22 September 2026. </w:t>
       </w:r>
-      <w:hyperlink r:id="rId68">
+      <w:hyperlink r:id="rId66">
         <w:r>
           <w:rPr>
             <w:color w:val="1F4E99"/>
@@ -1705,13 +1649,13 @@
           <w:b/>
           <w:color w:val="B31822"/>
         </w:rPr>
-        <w:t>60.</w:t>
+        <w:t>58.</w:t>
         <w:tab/>
       </w:r>
       <w:r>
         <w:t xml:space="preserve">The South First. “India has only 0.79 beds per 1,000 population in government hospitals; Short by 2.4 million hospital beds.” 16 December 2024. </w:t>
       </w:r>
-      <w:hyperlink r:id="rId69">
+      <w:hyperlink r:id="rId67">
         <w:r>
           <w:rPr>
             <w:color w:val="1F4E99"/>
@@ -1733,13 +1677,13 @@
           <w:b/>
           <w:color w:val="B31822"/>
         </w:rPr>
-        <w:t>61.</w:t>
+        <w:t>59.</w:t>
         <w:tab/>
       </w:r>
       <w:r>
         <w:t xml:space="preserve">National Statistics Office, Ministry of Statistics and Programme Implementation, Government of India. “Press Note on Survey on Household Social Consumption: Health, NSS 80th Round (January-December, 2025).” 2026. </w:t>
       </w:r>
-      <w:hyperlink r:id="rId70">
+      <w:hyperlink r:id="rId68">
         <w:r>
           <w:rPr>
             <w:color w:val="1F4E99"/>
@@ -1761,13 +1705,13 @@
           <w:b/>
           <w:color w:val="B31822"/>
         </w:rPr>
-        <w:t>62.</w:t>
+        <w:t>60.</w:t>
         <w:tab/>
       </w:r>
       <w:r>
         <w:t xml:space="preserve">Vajiram and Ravi. “NSO Health Survey Findings: Expanding Health Insurance, Uneven Results.” 30 April 2026. </w:t>
       </w:r>
-      <w:hyperlink r:id="rId71">
+      <w:hyperlink r:id="rId69">
         <w:r>
           <w:rPr>
             <w:color w:val="1F4E99"/>
@@ -1789,18 +1733,18 @@
           <w:b/>
           <w:color w:val="B31822"/>
         </w:rPr>
-        <w:t>63.</w:t>
+        <w:t>61.</w:t>
         <w:tab/>
       </w:r>
       <w:r>
-        <w:t xml:space="preserve">Down To Earth. “Private hospitals cost up to 10 times more than government facilities for same illnesses, NSO survey finds.” 5 May 2026. </w:t>
-      </w:r>
-      <w:hyperlink r:id="rId72">
+        <w:t xml:space="preserve">Oommen C. Kurian. “India's 2025 National Health Survey Update: Higher Access, Persistent Financial Risk.” Observer Research Foundation, 13 May 2026. </w:t>
+      </w:r>
+      <w:hyperlink r:id="rId70">
         <w:r>
           <w:rPr>
             <w:color w:val="1F4E99"/>
           </w:rPr>
-          <w:t xml:space="preserve">https://www.downtoearth.org.in/health/private-hospitals-cost-up-to-10-times-more-than-government-facilities-for-same-illnesses-nso-survey-finds</w:t>
+          <w:t xml:space="preserve">https://www.orfonline.org/expert-speak/india-s-2025-national-health-survey-update-higher-access-persistent-financial-risk</w:t>
         </w:r>
       </w:hyperlink>
     </w:p>
@@ -1817,13 +1761,13 @@
           <w:b/>
           <w:color w:val="B31822"/>
         </w:rPr>
-        <w:t>64.</w:t>
+        <w:t>62.</w:t>
         <w:tab/>
       </w:r>
       <w:r>
         <w:t xml:space="preserve">Groww. “Manipal Health IPO: Check Allotment Status, Listing Date, Listing Price.” </w:t>
       </w:r>
-      <w:hyperlink r:id="rId73">
+      <w:hyperlink r:id="rId71">
         <w:r>
           <w:rPr>
             <w:color w:val="1F4E99"/>
@@ -1845,13 +1789,13 @@
           <w:b/>
           <w:color w:val="B31822"/>
         </w:rPr>
-        <w:t>65.</w:t>
+        <w:t>63.</w:t>
         <w:tab/>
       </w:r>
       <w:r>
         <w:t xml:space="preserve">Business Standard. “Manipal Health lists at 11% premium, beats GMP estimates; should you buy?.” 5 August 2026. </w:t>
       </w:r>
-      <w:hyperlink r:id="rId74">
+      <w:hyperlink r:id="rId72">
         <w:r>
           <w:rPr>
             <w:color w:val="1F4E99"/>
@@ -1873,13 +1817,13 @@
           <w:b/>
           <w:color w:val="B31822"/>
         </w:rPr>
-        <w:t>66.</w:t>
+        <w:t>64.</w:t>
         <w:tab/>
       </w:r>
       <w:r>
         <w:t xml:space="preserve">Apollo Hospitals Enterprise Limited. “Apollo Hospitals Announces Strong Q4FY26 Performance and Key Strategic Milestones.” 20 May 2026. </w:t>
       </w:r>
-      <w:hyperlink r:id="rId75">
+      <w:hyperlink r:id="rId73">
         <w:r>
           <w:rPr>
             <w:color w:val="1F4E99"/>
@@ -1901,13 +1845,13 @@
           <w:b/>
           <w:color w:val="B31822"/>
         </w:rPr>
-        <w:t>67.</w:t>
+        <w:t>65.</w:t>
         <w:tab/>
       </w:r>
       <w:r>
         <w:t xml:space="preserve">BW Healthcare World. “Apollo Hospitals Q4 FY26 Profit Rises 36% To Rs 529 Crore, Revenue Up 18%.” 21 May 2026. </w:t>
       </w:r>
-      <w:hyperlink r:id="rId76">
+      <w:hyperlink r:id="rId74">
         <w:r>
           <w:rPr>
             <w:color w:val="1F4E99"/>
@@ -1929,13 +1873,13 @@
           <w:b/>
           <w:color w:val="B31822"/>
         </w:rPr>
-        <w:t>68.</w:t>
+        <w:t>66.</w:t>
         <w:tab/>
       </w:r>
       <w:r>
         <w:t xml:space="preserve">Aster DM Healthcare. “Aster and Blackstone-backed Quality Care have merged to establish one of the top 3 Hospital chains in India with 10,150+ beds.” 27 January 2025. </w:t>
       </w:r>
-      <w:hyperlink r:id="rId77">
+      <w:hyperlink r:id="rId75">
         <w:r>
           <w:rPr>
             <w:color w:val="1F4E99"/>
@@ -1957,13 +1901,13 @@
           <w:b/>
           <w:color w:val="B31822"/>
         </w:rPr>
-        <w:t>69.</w:t>
+        <w:t>67.</w:t>
         <w:tab/>
       </w:r>
       <w:r>
         <w:t xml:space="preserve">HealthCare Middle East &amp; Africa. “Aster DM Quality Care begins operations post-merger with over 10,600 beds.” 3 July 2026. </w:t>
       </w:r>
-      <w:hyperlink r:id="rId78">
+      <w:hyperlink r:id="rId76">
         <w:r>
           <w:rPr>
             <w:color w:val="1F4E99"/>
@@ -1985,18 +1929,18 @@
           <w:b/>
           <w:color w:val="B31822"/>
         </w:rPr>
-        <w:t>70.</w:t>
+        <w:t>68.</w:t>
         <w:tab/>
       </w:r>
       <w:r>
-        <w:t xml:space="preserve">InvestyWise. “Max Healthcare Q4 FY26 Revenue Rises 10% YoY to Rs 2,664 Crore.” 21 May 2026. </w:t>
-      </w:r>
-      <w:hyperlink r:id="rId79">
+        <w:t xml:space="preserve">Max Healthcare Institute Limited. “Earnings update: Q4 &amp; FY26 (filed with the stock exchanges under Regulation 30, SEBI LODR).” Max Healthcare Institute Limited, 21 May 2026. </w:t>
+      </w:r>
+      <w:hyperlink r:id="rId77">
         <w:r>
           <w:rPr>
             <w:color w:val="1F4E99"/>
           </w:rPr>
-          <w:t xml:space="preserve">https://www.investywise.com/max-healthcare-reports-strong-q4-and-fy26-financial-growth/</w:t>
+          <w:t xml:space="preserve">https://max-website20-images.s3.ap-south-1.amazonaws.com/SE_Intimation_Reg_30_LODR_Earnings_Update_21_05_2026_ed3cd6e592.pdf</w:t>
         </w:r>
       </w:hyperlink>
     </w:p>
@@ -2013,18 +1957,18 @@
           <w:b/>
           <w:color w:val="B31822"/>
         </w:rPr>
-        <w:t>71.</w:t>
+        <w:t>69.</w:t>
         <w:tab/>
       </w:r>
       <w:r>
-        <w:t xml:space="preserve">Whalesbook. “Max Healthcare FY26 Revenue at Rs 10,538 crore, eyes 10,000 beds by FY30.” 5 August 2026. </w:t>
-      </w:r>
-      <w:hyperlink r:id="rId80">
+        <w:t xml:space="preserve">Max Healthcare Institute Limited. “Pushing the Boundaries of Indian Healthcare: Integrated Annual Report 2025-26.” Max Healthcare Institute Limited, 2026. </w:t>
+      </w:r>
+      <w:hyperlink r:id="rId78">
         <w:r>
           <w:rPr>
             <w:color w:val="1F4E99"/>
           </w:rPr>
-          <w:t xml:space="preserve">https://www.whalesbook.com/corporate-news/English/healthcarebiotech/Max-Healthcare-FY26-Revenue-at-indian-rupee10538-crore-eyes-10000-beds-by-FY30/6a73792c10bce1fd203ff7d1</w:t>
+          <w:t xml:space="preserve">https://max-website20-images.s3.ap-south-1.amazonaws.com/FY_2025_26_Integrated_Annual_Report_ab5f34d431.pdf</w:t>
         </w:r>
       </w:hyperlink>
     </w:p>
@@ -2041,13 +1985,13 @@
           <w:b/>
           <w:color w:val="B31822"/>
         </w:rPr>
-        <w:t>72.</w:t>
+        <w:t>70.</w:t>
         <w:tab/>
       </w:r>
       <w:r>
         <w:t xml:space="preserve">Indian Pharma Post. “Medanta delivers record FY26 performance as revenue surges &amp; profit jumps with expansion.” 17 May 2026. </w:t>
       </w:r>
-      <w:hyperlink r:id="rId81">
+      <w:hyperlink r:id="rId79">
         <w:r>
           <w:rPr>
             <w:color w:val="1F4E99"/>
@@ -2069,13 +2013,13 @@
           <w:b/>
           <w:color w:val="B31822"/>
         </w:rPr>
-        <w:t>73.</w:t>
+        <w:t>71.</w:t>
         <w:tab/>
       </w:r>
       <w:r>
         <w:t xml:space="preserve">InvestyWise. “Fortis Healthcare IHH Completes Open Offer, Increases Stake.” 10 November 2025. </w:t>
       </w:r>
-      <w:hyperlink r:id="rId82">
+      <w:hyperlink r:id="rId80">
         <w:r>
           <w:rPr>
             <w:color w:val="1F4E99"/>
@@ -2097,41 +2041,13 @@
           <w:b/>
           <w:color w:val="B31822"/>
         </w:rPr>
-        <w:t>74.</w:t>
+        <w:t>72.</w:t>
         <w:tab/>
       </w:r>
       <w:r>
-        <w:t xml:space="preserve">Narayana Health. “Narayana Health Expands Its Global Footprint With Acquisition Of UK Based Practice Plus Group Hospitals.” 31 October 2025. </w:t>
-      </w:r>
-      <w:hyperlink r:id="rId83">
-        <w:r>
-          <w:rPr>
-            <w:color w:val="1F4E99"/>
-          </w:rPr>
-          <w:t xml:space="preserve">https://www.narayanahealth.org/news-media/narayana-health-expands-its-global-footprint-with-acquisition-of-UK-based-practice-plus-group-Hospitals</w:t>
-        </w:r>
-      </w:hyperlink>
-    </w:p>
-    <w:p>
-      <w:pPr>
-        <w:tabs>
-          <w:tab w:pos="567" w:val="left"/>
-        </w:tabs>
-        <w:spacing w:after="120"/>
-        <w:ind w:left="567" w:hanging="567"/>
-      </w:pPr>
-      <w:r>
-        <w:rPr>
-          <w:b/>
-          <w:color w:val="B31822"/>
-        </w:rPr>
-        <w:t>75.</w:t>
-        <w:tab/>
-      </w:r>
-      <w:r>
         <w:t xml:space="preserve">EY India. “India Healthcare Sector Records Strong FY26 Growth; Expansion and Capacity Build-Out Drive Momentum: EY-Parthenon Report.” 22 July 2026. </w:t>
       </w:r>
-      <w:hyperlink r:id="rId84">
+      <w:hyperlink r:id="rId81">
         <w:r>
           <w:rPr>
             <w:color w:val="1F4E99"/>
@@ -2153,13 +2069,13 @@
           <w:b/>
           <w:color w:val="B31822"/>
         </w:rPr>
-        <w:t>76.</w:t>
+        <w:t>73.</w:t>
         <w:tab/>
       </w:r>
       <w:r>
         <w:t xml:space="preserve">Business Standard. “India's hospital chains grow bigger even as expansion squeezes margins: EY.” 23 July 2026. </w:t>
       </w:r>
-      <w:hyperlink r:id="rId85">
+      <w:hyperlink r:id="rId82">
         <w:r>
           <w:rPr>
             <w:color w:val="1F4E99"/>
@@ -2181,13 +2097,13 @@
           <w:b/>
           <w:color w:val="B31822"/>
         </w:rPr>
-        <w:t>77.</w:t>
+        <w:t>74.</w:t>
         <w:tab/>
       </w:r>
       <w:r>
         <w:t xml:space="preserve">KKR. “KKR to Acquire Leading Multi-Specialty Healthcare Provider Medicover India.” Nasdaq, 6 August 2026. </w:t>
       </w:r>
-      <w:hyperlink r:id="rId86">
+      <w:hyperlink r:id="rId83">
         <w:r>
           <w:rPr>
             <w:color w:val="1F4E99"/>
@@ -2209,41 +2125,13 @@
           <w:b/>
           <w:color w:val="B31822"/>
         </w:rPr>
-        <w:t>78.</w:t>
+        <w:t>75.</w:t>
         <w:tab/>
       </w:r>
       <w:r>
-        <w:t xml:space="preserve">National Health Accounts Technical Secretariat, National Health Systems Resource Centre, Ministry of Health and Family Welfare, Government of India. “National Health Accounts Estimates for India 2022-23.” 2026. </w:t>
-      </w:r>
-      <w:hyperlink r:id="rId87">
-        <w:r>
-          <w:rPr>
-            <w:color w:val="1F4E99"/>
-          </w:rPr>
-          <w:t xml:space="preserve">https://nhsrcindia.org/sites/default/files/2026-05/NHA%202022-23%20Report.pdf</w:t>
-        </w:r>
-      </w:hyperlink>
-    </w:p>
-    <w:p>
-      <w:pPr>
-        <w:tabs>
-          <w:tab w:pos="567" w:val="left"/>
-        </w:tabs>
-        <w:spacing w:after="120"/>
-        <w:ind w:left="567" w:hanging="567"/>
-      </w:pPr>
-      <w:r>
-        <w:rPr>
-          <w:b/>
-          <w:color w:val="B31822"/>
-        </w:rPr>
-        <w:t>79.</w:t>
-        <w:tab/>
-      </w:r>
-      <w:r>
         <w:t xml:space="preserve">ThePrint. “As govt cut health spends post-Covid, Indians paid more out-of-pocket in 2022-23, reversing 10-yr trend.” </w:t>
       </w:r>
-      <w:hyperlink r:id="rId88">
+      <w:hyperlink r:id="rId84">
         <w:r>
           <w:rPr>
             <w:color w:val="1F4E99"/>
@@ -2265,13 +2153,13 @@
           <w:b/>
           <w:color w:val="B31822"/>
         </w:rPr>
-        <w:t>80.</w:t>
+        <w:t>76.</w:t>
         <w:tab/>
       </w:r>
       <w:r>
         <w:t xml:space="preserve">Press Information Bureau, Government of India. “Union Health Ministry Releases The National Health Accounts Estimates for India 2022-23.” 27 May 2026. </w:t>
       </w:r>
-      <w:hyperlink r:id="rId89">
+      <w:hyperlink r:id="rId85">
         <w:r>
           <w:rPr>
             <w:color w:val="1F4E99"/>
@@ -2293,13 +2181,13 @@
           <w:b/>
           <w:color w:val="B31822"/>
         </w:rPr>
-        <w:t>81.</w:t>
+        <w:t>77.</w:t>
         <w:tab/>
       </w:r>
       <w:r>
         <w:t xml:space="preserve">Social News XYZ. “Govt health expenditure rises to 1.43 pc of GDP in FY23: Ministry.” 27 May 2026. </w:t>
       </w:r>
-      <w:hyperlink r:id="rId90">
+      <w:hyperlink r:id="rId86">
         <w:r>
           <w:rPr>
             <w:color w:val="1F4E99"/>
@@ -2321,13 +2209,13 @@
           <w:b/>
           <w:color w:val="B31822"/>
         </w:rPr>
-        <w:t>82.</w:t>
+        <w:t>78.</w:t>
         <w:tab/>
       </w:r>
       <w:r>
         <w:t xml:space="preserve">Vajiram and Ravi. “15th Finance Commission, Recommendations.” </w:t>
       </w:r>
-      <w:hyperlink r:id="rId91">
+      <w:hyperlink r:id="rId87">
         <w:r>
           <w:rPr>
             <w:color w:val="1F4E99"/>
@@ -2349,13 +2237,13 @@
           <w:b/>
           <w:color w:val="B31822"/>
         </w:rPr>
-        <w:t>83.</w:t>
+        <w:t>79.</w:t>
         <w:tab/>
       </w:r>
       <w:r>
         <w:t xml:space="preserve">Down To Earth. “India's per capita health expense jumped 82% in last decade: National Health Accounts Estimates.” 27 September 2024. </w:t>
       </w:r>
-      <w:hyperlink r:id="rId92">
+      <w:hyperlink r:id="rId88">
         <w:r>
           <w:rPr>
             <w:color w:val="1F4E99"/>
@@ -2377,13 +2265,13 @@
           <w:b/>
           <w:color w:val="B31822"/>
         </w:rPr>
-        <w:t>84.</w:t>
+        <w:t>80.</w:t>
         <w:tab/>
       </w:r>
       <w:r>
         <w:t xml:space="preserve">Deccan Herald. “Doctor-population ratio 1:811 in India: Union Health Minister J P Nadda.” 2 December 2025. </w:t>
       </w:r>
-      <w:hyperlink r:id="rId93">
+      <w:hyperlink r:id="rId89">
         <w:r>
           <w:rPr>
             <w:color w:val="1F4E99"/>
@@ -2405,13 +2293,13 @@
           <w:b/>
           <w:color w:val="B31822"/>
         </w:rPr>
-        <w:t>85.</w:t>
+        <w:t>81.</w:t>
         <w:tab/>
       </w:r>
       <w:r>
         <w:t xml:space="preserve">Digital Health News. “India Has Only One Doctor per 811 People, Government Data Shows.” 4 December 2025. </w:t>
       </w:r>
-      <w:hyperlink r:id="rId94">
+      <w:hyperlink r:id="rId90">
         <w:r>
           <w:rPr>
             <w:color w:val="1F4E99"/>
@@ -2433,13 +2321,13 @@
           <w:b/>
           <w:color w:val="B31822"/>
         </w:rPr>
-        <w:t>86.</w:t>
+        <w:t>82.</w:t>
         <w:tab/>
       </w:r>
       <w:r>
         <w:t xml:space="preserve">DD News. “13.86 lakh registered allopathic doctors, 7.51 lakh practitioners in AYUSH system: Centre.” 1 April 2025. </w:t>
       </w:r>
-      <w:hyperlink r:id="rId95">
+      <w:hyperlink r:id="rId91">
         <w:r>
           <w:rPr>
             <w:color w:val="1F4E99"/>
@@ -2461,13 +2349,13 @@
           <w:b/>
           <w:color w:val="B31822"/>
         </w:rPr>
-        <w:t>87.</w:t>
+        <w:t>83.</w:t>
         <w:tab/>
       </w:r>
       <w:r>
         <w:t xml:space="preserve">The South First. “South India leads India's nursing workforce as national ratio remains below WHO benchmark.” 24 July 2026. </w:t>
       </w:r>
-      <w:hyperlink r:id="rId96">
+      <w:hyperlink r:id="rId92">
         <w:r>
           <w:rPr>
             <w:color w:val="1F4E99"/>
@@ -2489,13 +2377,13 @@
           <w:b/>
           <w:color w:val="B31822"/>
         </w:rPr>
-        <w:t>88.</w:t>
+        <w:t>84.</w:t>
         <w:tab/>
       </w:r>
       <w:r>
         <w:t xml:space="preserve">Chennai Online. “NRTS Implementation Uneven Across India.” 10 August 2026. </w:t>
       </w:r>
-      <w:hyperlink r:id="rId97">
+      <w:hyperlink r:id="rId93">
         <w:r>
           <w:rPr>
             <w:color w:val="1F4E99"/>
@@ -2517,13 +2405,13 @@
           <w:b/>
           <w:color w:val="B31822"/>
         </w:rPr>
-        <w:t>89.</w:t>
+        <w:t>85.</w:t>
         <w:tab/>
       </w:r>
       <w:r>
         <w:t xml:space="preserve">World Health Organization. “Global strategy on human resources for health: Workforce 2030.” 2016. </w:t>
       </w:r>
-      <w:hyperlink r:id="rId98">
+      <w:hyperlink r:id="rId94">
         <w:r>
           <w:rPr>
             <w:color w:val="1F4E99"/>
@@ -2545,13 +2433,13 @@
           <w:b/>
           <w:color w:val="B31822"/>
         </w:rPr>
-        <w:t>90.</w:t>
+        <w:t>86.</w:t>
         <w:tab/>
       </w:r>
       <w:r>
         <w:t xml:space="preserve">OECD. “Doctors (overall number and distribution): Health at a Glance 2025.” 2025. </w:t>
       </w:r>
-      <w:hyperlink r:id="rId99">
+      <w:hyperlink r:id="rId95">
         <w:r>
           <w:rPr>
             <w:color w:val="1F4E99"/>
@@ -2573,13 +2461,13 @@
           <w:b/>
           <w:color w:val="B31822"/>
         </w:rPr>
-        <w:t>91.</w:t>
+        <w:t>87.</w:t>
         <w:tab/>
       </w:r>
       <w:r>
         <w:t xml:space="preserve">OECD. “Nurses: Health at a Glance 2025.” 2025. </w:t>
       </w:r>
-      <w:hyperlink r:id="rId100">
+      <w:hyperlink r:id="rId96">
         <w:r>
           <w:rPr>
             <w:color w:val="1F4E99"/>
@@ -2601,13 +2489,13 @@
           <w:b/>
           <w:color w:val="B31822"/>
         </w:rPr>
-        <w:t>92.</w:t>
+        <w:t>88.</w:t>
         <w:tab/>
       </w:r>
       <w:r>
         <w:t xml:space="preserve">OECD. “Hospital beds and occupancy: Health at a Glance 2025.” 2025. </w:t>
       </w:r>
-      <w:hyperlink r:id="rId101">
+      <w:hyperlink r:id="rId97">
         <w:r>
           <w:rPr>
             <w:color w:val="1F4E99"/>
@@ -2629,13 +2517,41 @@
           <w:b/>
           <w:color w:val="B31822"/>
         </w:rPr>
-        <w:t>93.</w:t>
+        <w:t>89.</w:t>
         <w:tab/>
       </w:r>
       <w:r>
+        <w:t xml:space="preserve">Sohini Das. “Rural India CHCs see nearly 80% shortfall of specialist doctors: Govt report.” Business Standard, 10 September 2024. </w:t>
+      </w:r>
+      <w:hyperlink r:id="rId98">
+        <w:r>
+          <w:rPr>
+            <w:color w:val="1F4E99"/>
+          </w:rPr>
+          <w:t xml:space="preserve">https://www.business-standard.com/health/rural-india-chc-s-see-nearly-80-shortfall-of-specialist-doctors-govt-rpt-124091000561_1.html</w:t>
+        </w:r>
+      </w:hyperlink>
+    </w:p>
+    <w:p>
+      <w:pPr>
+        <w:tabs>
+          <w:tab w:pos="567" w:val="left"/>
+        </w:tabs>
+        <w:spacing w:after="120"/>
+        <w:ind w:left="567" w:hanging="567"/>
+      </w:pPr>
+      <w:r>
+        <w:rPr>
+          <w:b/>
+          <w:color w:val="B31822"/>
+        </w:rPr>
+        <w:t>90.</w:t>
+        <w:tab/>
+      </w:r>
+      <w:r>
         <w:t xml:space="preserve">NewKerala. “Budget 2026: 1 Lakh Allied Health Pros, Medical Tourism Hubs.” </w:t>
       </w:r>
-      <w:hyperlink r:id="rId102">
+      <w:hyperlink r:id="rId99">
         <w:r>
           <w:rPr>
             <w:color w:val="1F4E99"/>
@@ -2657,18 +2573,102 @@
           <w:b/>
           <w:color w:val="B31822"/>
         </w:rPr>
+        <w:t>91.</w:t>
+        <w:tab/>
+      </w:r>
+      <w:r>
+        <w:t xml:space="preserve">Press Information Bureau, Government of India. “Historic reform in Medical Education: National Medical Commission (NMC) constituted.” Press Information Bureau, 25 September 2020. </w:t>
+      </w:r>
+      <w:hyperlink r:id="rId100">
+        <w:r>
+          <w:rPr>
+            <w:color w:val="1F4E99"/>
+          </w:rPr>
+          <w:t xml:space="preserve">https://www.pib.gov.in/PressReleasePage.aspx?PRID=1659029</w:t>
+        </w:r>
+      </w:hyperlink>
+    </w:p>
+    <w:p>
+      <w:pPr>
+        <w:tabs>
+          <w:tab w:pos="567" w:val="left"/>
+        </w:tabs>
+        <w:spacing w:after="120"/>
+        <w:ind w:left="567" w:hanging="567"/>
+      </w:pPr>
+      <w:r>
+        <w:rPr>
+          <w:b/>
+          <w:color w:val="B31822"/>
+        </w:rPr>
+        <w:t>92.</w:t>
+        <w:tab/>
+      </w:r>
+      <w:r>
+        <w:t xml:space="preserve">National Testing Agency, Ministry of Education, Government of India. “NTA Declares Result of NEET (UG) 2026.” 16 July 2026. </w:t>
+      </w:r>
+      <w:hyperlink r:id="rId101">
+        <w:r>
+          <w:rPr>
+            <w:color w:val="1F4E99"/>
+          </w:rPr>
+          <w:t xml:space="preserve">https://cdnbbsr.s3waas.gov.in/s37bc1ec1d9c3426357e69acd5bf320061/uploads/2026/07/20260716477215762.pdf</w:t>
+        </w:r>
+      </w:hyperlink>
+    </w:p>
+    <w:p>
+      <w:pPr>
+        <w:tabs>
+          <w:tab w:pos="567" w:val="left"/>
+        </w:tabs>
+        <w:spacing w:after="120"/>
+        <w:ind w:left="567" w:hanging="567"/>
+      </w:pPr>
+      <w:r>
+        <w:rPr>
+          <w:b/>
+          <w:color w:val="B31822"/>
+        </w:rPr>
+        <w:t>93.</w:t>
+        <w:tab/>
+      </w:r>
+      <w:r>
+        <w:t xml:space="preserve">DD News. “NEET-UG 2026 cancelled, fresh exam to be held; CBI probe ordered.” Prasar Bharati, 12 May 2026. </w:t>
+      </w:r>
+      <w:hyperlink r:id="rId102">
+        <w:r>
+          <w:rPr>
+            <w:color w:val="1F4E99"/>
+          </w:rPr>
+          <w:t xml:space="preserve">https://ddnews.gov.in/en/neet-ug-2026-cancelled-fresh-exam-to-be-held-cbi-probe-ordered/</w:t>
+        </w:r>
+      </w:hyperlink>
+    </w:p>
+    <w:p>
+      <w:pPr>
+        <w:tabs>
+          <w:tab w:pos="567" w:val="left"/>
+        </w:tabs>
+        <w:spacing w:after="120"/>
+        <w:ind w:left="567" w:hanging="567"/>
+      </w:pPr>
+      <w:r>
+        <w:rPr>
+          <w:b/>
+          <w:color w:val="B31822"/>
+        </w:rPr>
         <w:t>94.</w:t>
         <w:tab/>
       </w:r>
       <w:r>
-        <w:t xml:space="preserve">Wikipedia contributors. “2026 NEET scandal.” Wikipedia. </w:t>
+        <w:t xml:space="preserve">Outlook News Desk. “NEET-UG 2026 Exam Cancelled, Re-Exam Scheduled For June 21 By NTA.” Outlook India, 15 May 2026. </w:t>
       </w:r>
       <w:hyperlink r:id="rId103">
         <w:r>
           <w:rPr>
             <w:color w:val="1F4E99"/>
           </w:rPr>
-          <w:t xml:space="preserve">https://en.wikipedia.org/wiki/2026_NEET_controversy</w:t>
+          <w:t xml:space="preserve">https://www.outlookindia.com/national/neet-ug-2026-exam-cancelled-re-exam-scheduled-for-june-21-by-nta</w:t>
         </w:r>
       </w:hyperlink>
     </w:p>
@@ -2717,37 +2717,9 @@
         <w:tab/>
       </w:r>
       <w:r>
-        <w:t xml:space="preserve">National Testing Agency, Ministry of Education, Government of India. “NTA Declares Result of NEET (UG) 2026.” 16 July 2026. </w:t>
+        <w:t xml:space="preserve">Medical Dialogues. “1,40,664 MBBS seats across 839 medical colleges for 2026-27, 1,27,028 renewed, 13,636 increased: NMC updates seat matrix.” 22 September 2026. </w:t>
       </w:r>
       <w:hyperlink r:id="rId105">
-        <w:r>
-          <w:rPr>
-            <w:color w:val="1F4E99"/>
-          </w:rPr>
-          <w:t xml:space="preserve">https://cdnbbsr.s3waas.gov.in/s37bc1ec1d9c3426357e69acd5bf320061/uploads/2026/07/20260716477215762.pdf</w:t>
-        </w:r>
-      </w:hyperlink>
-    </w:p>
-    <w:p>
-      <w:pPr>
-        <w:tabs>
-          <w:tab w:pos="567" w:val="left"/>
-        </w:tabs>
-        <w:spacing w:after="120"/>
-        <w:ind w:left="567" w:hanging="567"/>
-      </w:pPr>
-      <w:r>
-        <w:rPr>
-          <w:b/>
-          <w:color w:val="B31822"/>
-        </w:rPr>
-        <w:t>97.</w:t>
-        <w:tab/>
-      </w:r>
-      <w:r>
-        <w:t xml:space="preserve">Medical Dialogues. “1,40,664 MBBS seats across 839 medical colleges for 2026-27, 1,27,028 renewed, 13,636 increased: NMC updates seat matrix.” 22 September 2026. </w:t>
-      </w:r>
-      <w:hyperlink r:id="rId106">
         <w:r>
           <w:rPr>
             <w:color w:val="1F4E99"/>
@@ -2769,69 +2741,13 @@
           <w:b/>
           <w:color w:val="B31822"/>
         </w:rPr>
-        <w:t>98.</w:t>
+        <w:t>97.</w:t>
         <w:tab/>
       </w:r>
       <w:r>
-        <w:t xml:space="preserve">Sakshi Education. “MBBS Seats Cross 1.29 Lakh in 2025-26: Karnataka Tops, Check NMC Seat Matrix.” 17 December 2025. </w:t>
-      </w:r>
-      <w:hyperlink r:id="rId107">
-        <w:r>
-          <w:rPr>
-            <w:color w:val="1F4E99"/>
-          </w:rPr>
-          <w:t xml:space="preserve">https://education.sakshi.com/en/neet/education-news/mbbs-seats-cross-129-lakh-india-check-seat-matrix-186935</w:t>
-        </w:r>
-      </w:hyperlink>
-    </w:p>
-    <w:p>
-      <w:pPr>
-        <w:tabs>
-          <w:tab w:pos="567" w:val="left"/>
-        </w:tabs>
-        <w:spacing w:after="120"/>
-        <w:ind w:left="567" w:hanging="567"/>
-      </w:pPr>
-      <w:r>
-        <w:rPr>
-          <w:b/>
-          <w:color w:val="B31822"/>
-        </w:rPr>
-        <w:t>99.</w:t>
-        <w:tab/>
-      </w:r>
-      <w:r>
-        <w:t xml:space="preserve">Careers360. “NMC approves 10,650 new MBBS seats, 41 new medical colleges for 2024-25.” 19 October 2025. </w:t>
-      </w:r>
-      <w:hyperlink r:id="rId108">
-        <w:r>
-          <w:rPr>
-            <w:color w:val="1F4E99"/>
-          </w:rPr>
-          <w:t xml:space="preserve">https://news.careers360.com/nmc-approves-neet-ug-pg-10650-new-mbbs-seats-41-new-medical-colleges-for-2024-25-counselling-admission/amp</w:t>
-        </w:r>
-      </w:hyperlink>
-    </w:p>
-    <w:p>
-      <w:pPr>
-        <w:tabs>
-          <w:tab w:pos="567" w:val="left"/>
-        </w:tabs>
-        <w:spacing w:after="120"/>
-        <w:ind w:left="567" w:hanging="567"/>
-      </w:pPr>
-      <w:r>
-        <w:rPr>
-          <w:b/>
-          <w:color w:val="B31822"/>
-        </w:rPr>
-        <w:t>100.</w:t>
-        <w:tab/>
-      </w:r>
-      <w:r>
         <w:t xml:space="preserve">Medical Dialogues. “7619 PG medical seats approved for 2025-26, total 57,503 seats available: NMC seat matrix.” 19 December 2025. </w:t>
       </w:r>
-      <w:hyperlink r:id="rId109">
+      <w:hyperlink r:id="rId106">
         <w:r>
           <w:rPr>
             <w:color w:val="1F4E99"/>
@@ -2853,13 +2769,41 @@
           <w:b/>
           <w:color w:val="B31822"/>
         </w:rPr>
-        <w:t>101.</w:t>
+        <w:t>98.</w:t>
         <w:tab/>
       </w:r>
       <w:r>
+        <w:t xml:space="preserve">National Board of Examinations in Medical Sciences. “About NBEMS.” National Board of Examinations in Medical Sciences. </w:t>
+      </w:r>
+      <w:hyperlink r:id="rId107">
+        <w:r>
+          <w:rPr>
+            <w:color w:val="1F4E99"/>
+          </w:rPr>
+          <w:t xml:space="preserve">https://natboard.edu.in/aboutus.php</w:t>
+        </w:r>
+      </w:hyperlink>
+    </w:p>
+    <w:p>
+      <w:pPr>
+        <w:tabs>
+          <w:tab w:pos="567" w:val="left"/>
+        </w:tabs>
+        <w:spacing w:after="120"/>
+        <w:ind w:left="567" w:hanging="567"/>
+      </w:pPr>
+      <w:r>
+        <w:rPr>
+          <w:b/>
+          <w:color w:val="B31822"/>
+        </w:rPr>
+        <w:t>99.</w:t>
+        <w:tab/>
+      </w:r>
+      <w:r>
         <w:t xml:space="preserve">Medical Dialogues. “NExT exam deferred for few years till NMC perfects the model.” 29 October 2025. </w:t>
       </w:r>
-      <w:hyperlink r:id="rId110">
+      <w:hyperlink r:id="rId108">
         <w:r>
           <w:rPr>
             <w:color w:val="1F4E99"/>
@@ -2881,13 +2825,13 @@
           <w:b/>
           <w:color w:val="B31822"/>
         </w:rPr>
-        <w:t>102.</w:t>
+        <w:t>100.</w:t>
         <w:tab/>
       </w:r>
       <w:r>
         <w:t xml:space="preserve">Adani Group. “Adani to Partner Mayo Clinic to Establish Affordable World Class Healthcare Facilities.” 10 February 2025. </w:t>
       </w:r>
-      <w:hyperlink r:id="rId111">
+      <w:hyperlink r:id="rId109">
         <w:r>
           <w:rPr>
             <w:color w:val="1F4E99"/>
@@ -2909,13 +2853,13 @@
           <w:b/>
           <w:color w:val="B31822"/>
         </w:rPr>
-        <w:t>103.</w:t>
+        <w:t>101.</w:t>
         <w:tab/>
       </w:r>
       <w:r>
         <w:t xml:space="preserve">IBEF. “Ayushman Bharat Digital Mission crosses 93.95 crore ABHA IDs, strengthens India's digital healthcare ecosystem.” 13 July 2026. </w:t>
       </w:r>
-      <w:hyperlink r:id="rId112">
+      <w:hyperlink r:id="rId110">
         <w:r>
           <w:rPr>
             <w:color w:val="1F4E99"/>
@@ -2937,13 +2881,13 @@
           <w:b/>
           <w:color w:val="B31822"/>
         </w:rPr>
-        <w:t>104.</w:t>
+        <w:t>102.</w:t>
         <w:tab/>
       </w:r>
       <w:r>
         <w:t xml:space="preserve">GKToday. “Ayushman Bharat Digital Mission Crosses 93.95 Crore Health Accounts.” </w:t>
       </w:r>
-      <w:hyperlink r:id="rId113">
+      <w:hyperlink r:id="rId111">
         <w:r>
           <w:rPr>
             <w:color w:val="1F4E99"/>
@@ -2965,41 +2909,13 @@
           <w:b/>
           <w:color w:val="B31822"/>
         </w:rPr>
-        <w:t>105.</w:t>
+        <w:t>103.</w:t>
         <w:tab/>
       </w:r>
       <w:r>
-        <w:t xml:space="preserve">The Week. “Union Budget 2026: From BioPharma Shakti to medical tourism hubs, KEY announcements for health sector.” 1 February 2026. </w:t>
-      </w:r>
-      <w:hyperlink r:id="rId114">
-        <w:r>
-          <w:rPr>
-            <w:color w:val="1F4E99"/>
-          </w:rPr>
-          <w:t xml:space="preserve">https://www.theweek.in/news/health/2026/02/01/union-budget-2026-from-biopharma-shakti-to-medical-tourism-hubs-key-announcements-for-health-sector.html</w:t>
-        </w:r>
-      </w:hyperlink>
-    </w:p>
-    <w:p>
-      <w:pPr>
-        <w:tabs>
-          <w:tab w:pos="567" w:val="left"/>
-        </w:tabs>
-        <w:spacing w:after="120"/>
-        <w:ind w:left="567" w:hanging="567"/>
-      </w:pPr>
-      <w:r>
-        <w:rPr>
-          <w:b/>
-          <w:color w:val="B31822"/>
-        </w:rPr>
-        <w:t>106.</w:t>
-        <w:tab/>
-      </w:r>
-      <w:r>
         <w:t xml:space="preserve">BW Healthcare World. “Maharashtra Signs $1.2 Billion Deal To Develop Navi Mumbai MediCity.” 11 June 2026. </w:t>
       </w:r>
-      <w:hyperlink r:id="rId115">
+      <w:hyperlink r:id="rId112">
         <w:r>
           <w:rPr>
             <w:color w:val="1F4E99"/>
@@ -3021,13 +2937,13 @@
           <w:b/>
           <w:color w:val="B31822"/>
         </w:rPr>
-        <w:t>107.</w:t>
+        <w:t>104.</w:t>
         <w:tab/>
       </w:r>
       <w:r>
         <w:t xml:space="preserve">DD News. “Over 6.4 lakh foreign tourists visited India for medical treatment in 2024.” 9 February 2026. </w:t>
       </w:r>
-      <w:hyperlink r:id="rId116">
+      <w:hyperlink r:id="rId113">
         <w:r>
           <w:rPr>
             <w:color w:val="1F4E99"/>
@@ -3049,13 +2965,13 @@
           <w:b/>
           <w:color w:val="B31822"/>
         </w:rPr>
-        <w:t>108.</w:t>
+        <w:t>105.</w:t>
         <w:tab/>
       </w:r>
       <w:r>
         <w:t xml:space="preserve">InsightsIAS. “Medical Tourism in India.” 8 August 2025. </w:t>
       </w:r>
-      <w:hyperlink r:id="rId117">
+      <w:hyperlink r:id="rId114">
         <w:r>
           <w:rPr>
             <w:color w:val="1F4E99"/>
@@ -3077,13 +2993,13 @@
           <w:b/>
           <w:color w:val="B31822"/>
         </w:rPr>
-        <w:t>109.</w:t>
+        <w:t>106.</w:t>
         <w:tab/>
       </w:r>
       <w:r>
         <w:t xml:space="preserve">BusinessToday. “India's medical tourism takes a hit as patient arrivals from Bangladesh plunge amid visa restrictions.” 2 March 2025. </w:t>
       </w:r>
-      <w:hyperlink r:id="rId118">
+      <w:hyperlink r:id="rId115">
         <w:r>
           <w:rPr>
             <w:color w:val="1F4E99"/>
@@ -3105,13 +3021,13 @@
           <w:b/>
           <w:color w:val="B31822"/>
         </w:rPr>
-        <w:t>110.</w:t>
+        <w:t>107.</w:t>
         <w:tab/>
       </w:r>
       <w:r>
         <w:t xml:space="preserve">Mayo Clinic. “AIG Hospitals in India joins Mayo Clinic Care Network.” Newswise, 24 October 2019. </w:t>
       </w:r>
-      <w:hyperlink r:id="rId119">
+      <w:hyperlink r:id="rId116">
         <w:r>
           <w:rPr>
             <w:color w:val="1F4E99"/>
@@ -3133,13 +3049,13 @@
           <w:b/>
           <w:color w:val="B31822"/>
         </w:rPr>
-        <w:t>111.</w:t>
+        <w:t>108.</w:t>
         <w:tab/>
       </w:r>
       <w:r>
         <w:t xml:space="preserve">Mayo Clinic. “AIG Hospitals in India joins Mayo Clinic Care Network.” Mayo Clinic News Network, 24 October 2019. </w:t>
       </w:r>
-      <w:hyperlink r:id="rId120">
+      <w:hyperlink r:id="rId117">
         <w:r>
           <w:rPr>
             <w:color w:val="1F4E99"/>
@@ -3161,13 +3077,13 @@
           <w:b/>
           <w:color w:val="B31822"/>
         </w:rPr>
-        <w:t>112.</w:t>
+        <w:t>109.</w:t>
         <w:tab/>
       </w:r>
       <w:r>
         <w:t xml:space="preserve">Post Bulletin. “Billionaire to partner with Mayo Clinic on India hospitals.” 11 February 2025. </w:t>
       </w:r>
-      <w:hyperlink r:id="rId121">
+      <w:hyperlink r:id="rId118">
         <w:r>
           <w:rPr>
             <w:color w:val="1F4E99"/>
@@ -3189,13 +3105,69 @@
           <w:b/>
           <w:color w:val="B31822"/>
         </w:rPr>
-        <w:t>113.</w:t>
+        <w:t>110.</w:t>
         <w:tab/>
       </w:r>
       <w:r>
+        <w:t xml:space="preserve">Press Trust of India. “Lilavati Hospital, Mayo Clinic to establish 300-bed cancer institute in Mumbai.” Medical Buyer, 24 January 2025. </w:t>
+      </w:r>
+      <w:hyperlink r:id="rId119">
+        <w:r>
+          <w:rPr>
+            <w:color w:val="1F4E99"/>
+          </w:rPr>
+          <w:t xml:space="preserve">https://medicalbuyer.co.in/lilavati-hospital-mayo-clinic-to-establish-300-bed-cancer-institute-in-mumbai/</w:t>
+        </w:r>
+      </w:hyperlink>
+    </w:p>
+    <w:p>
+      <w:pPr>
+        <w:tabs>
+          <w:tab w:pos="567" w:val="left"/>
+        </w:tabs>
+        <w:spacing w:after="120"/>
+        <w:ind w:left="567" w:hanging="567"/>
+      </w:pPr>
+      <w:r>
+        <w:rPr>
+          <w:b/>
+          <w:color w:val="B31822"/>
+        </w:rPr>
+        <w:t>111.</w:t>
+        <w:tab/>
+      </w:r>
+      <w:r>
+        <w:t xml:space="preserve">Kajal Rajput. “Mayo Clinic, Lilavati Hospital complete India's first Nursing Excellence Training Program.” Medical Dialogues, 29 March 2025. </w:t>
+      </w:r>
+      <w:hyperlink r:id="rId120">
+        <w:r>
+          <w:rPr>
+            <w:color w:val="1F4E99"/>
+          </w:rPr>
+          <w:t xml:space="preserve">https://medicaldialogues.in/news/health/hospital-diagnostics/mayo-clinic-lilavati-hospital-complete-indias-first-nursing-excellence-training-program-145698</w:t>
+        </w:r>
+      </w:hyperlink>
+    </w:p>
+    <w:p>
+      <w:pPr>
+        <w:tabs>
+          <w:tab w:pos="567" w:val="left"/>
+        </w:tabs>
+        <w:spacing w:after="120"/>
+        <w:ind w:left="567" w:hanging="567"/>
+      </w:pPr>
+      <w:r>
+        <w:rPr>
+          <w:b/>
+          <w:color w:val="B31822"/>
+        </w:rPr>
+        <w:t>112.</w:t>
+        <w:tab/>
+      </w:r>
+      <w:r>
         <w:t xml:space="preserve">Mayo Clinic. “Mayo Clinic opens patient information office in India.” Newswise, 6 February 2023. </w:t>
       </w:r>
-      <w:hyperlink r:id="rId122">
+      <w:hyperlink r:id="rId121">
         <w:r>
           <w:rPr>
             <w:color w:val="1F4E99"/>
@@ -3217,69 +3189,13 @@
           <w:b/>
           <w:color w:val="B31822"/>
         </w:rPr>
-        <w:t>114.</w:t>
+        <w:t>113.</w:t>
         <w:tab/>
       </w:r>
       <w:r>
-        <w:t xml:space="preserve">Press Trust of India. “Lilavati Hospital, Mayo Clinic to establish 300-bed cancer institute in Mumbai.” Medical Buyer, 24 January 2025. </w:t>
-      </w:r>
-      <w:hyperlink r:id="rId123">
-        <w:r>
-          <w:rPr>
-            <w:color w:val="1F4E99"/>
-          </w:rPr>
-          <w:t xml:space="preserve">https://medicalbuyer.co.in/lilavati-hospital-mayo-clinic-to-establish-300-bed-cancer-institute-in-mumbai/</w:t>
-        </w:r>
-      </w:hyperlink>
-    </w:p>
-    <w:p>
-      <w:pPr>
-        <w:tabs>
-          <w:tab w:pos="567" w:val="left"/>
-        </w:tabs>
-        <w:spacing w:after="120"/>
-        <w:ind w:left="567" w:hanging="567"/>
-      </w:pPr>
-      <w:r>
-        <w:rPr>
-          <w:b/>
-          <w:color w:val="B31822"/>
-        </w:rPr>
-        <w:t>115.</w:t>
-        <w:tab/>
-      </w:r>
-      <w:r>
-        <w:t xml:space="preserve">Kajal Rajput. “Mayo Clinic, Lilavati Hospital complete India's first Nursing Excellence Training Program.” Medical Dialogues, 29 March 2025. </w:t>
-      </w:r>
-      <w:hyperlink r:id="rId124">
-        <w:r>
-          <w:rPr>
-            <w:color w:val="1F4E99"/>
-          </w:rPr>
-          <w:t xml:space="preserve">https://medicaldialogues.in/news/health/hospital-diagnostics/mayo-clinic-lilavati-hospital-complete-indias-first-nursing-excellence-training-program-145698</w:t>
-        </w:r>
-      </w:hyperlink>
-    </w:p>
-    <w:p>
-      <w:pPr>
-        <w:tabs>
-          <w:tab w:pos="567" w:val="left"/>
-        </w:tabs>
-        <w:spacing w:after="120"/>
-        <w:ind w:left="567" w:hanging="567"/>
-      </w:pPr>
-      <w:r>
-        <w:rPr>
-          <w:b/>
-          <w:color w:val="B31822"/>
-        </w:rPr>
-        <w:t>116.</w:t>
-        <w:tab/>
-      </w:r>
-      <w:r>
         <w:t xml:space="preserve">Anurag Roushan. “Maharashtra's mega 'MediCity' takes off: Cleveland Clinic joins Rs 10,000 crore healthcare hub.” India TV News, 11 June 2026. </w:t>
       </w:r>
-      <w:hyperlink r:id="rId125">
+      <w:hyperlink r:id="rId122">
         <w:r>
           <w:rPr>
             <w:color w:val="1F4E99"/>
@@ -3301,13 +3217,13 @@
           <w:b/>
           <w:color w:val="B31822"/>
         </w:rPr>
-        <w:t>117.</w:t>
+        <w:t>114.</w:t>
         <w:tab/>
       </w:r>
       <w:r>
         <w:t xml:space="preserve">Cleveland Clinic. “India Resources: A Top Hospital In The US.” </w:t>
       </w:r>
-      <w:hyperlink r:id="rId126">
+      <w:hyperlink r:id="rId123">
         <w:r>
           <w:rPr>
             <w:color w:val="1F4E99"/>
@@ -3329,13 +3245,13 @@
           <w:b/>
           <w:color w:val="B31822"/>
         </w:rPr>
-        <w:t>118.</w:t>
+        <w:t>115.</w:t>
         <w:tab/>
       </w:r>
       <w:r>
         <w:t xml:space="preserve">Johns Hopkins Medicine International. “HCL Healthcare.” </w:t>
       </w:r>
-      <w:hyperlink r:id="rId127">
+      <w:hyperlink r:id="rId124">
         <w:r>
           <w:rPr>
             <w:color w:val="1F4E99"/>
@@ -3357,13 +3273,13 @@
           <w:b/>
           <w:color w:val="B31822"/>
         </w:rPr>
-        <w:t>119.</w:t>
+        <w:t>116.</w:t>
         <w:tab/>
       </w:r>
       <w:r>
         <w:t xml:space="preserve">Domain-b. “HCL enters healthcare with HCL Avitas.” 6 February 2014. </w:t>
       </w:r>
-      <w:hyperlink r:id="rId128">
+      <w:hyperlink r:id="rId125">
         <w:r>
           <w:rPr>
             <w:color w:val="1F4E99"/>
@@ -3385,13 +3301,13 @@
           <w:b/>
           <w:color w:val="B31822"/>
         </w:rPr>
-        <w:t>120.</w:t>
+        <w:t>117.</w:t>
         <w:tab/>
       </w:r>
       <w:r>
         <w:t xml:space="preserve">Gupta-Klinsky India Institute, Johns Hopkins University. “Collaboration Agreement with IIT Bombay and Roundtable Discussion Shine a Spotlight on Digital Health.” </w:t>
       </w:r>
-      <w:hyperlink r:id="rId129">
+      <w:hyperlink r:id="rId126">
         <w:r>
           <w:rPr>
             <w:color w:val="1F4E99"/>
@@ -3413,13 +3329,13 @@
           <w:b/>
           <w:color w:val="B31822"/>
         </w:rPr>
-        <w:t>121.</w:t>
+        <w:t>118.</w:t>
         <w:tab/>
       </w:r>
       <w:r>
         <w:t xml:space="preserve">Memorial Sloan Kettering Cancer Center. “Memorial Sloan Kettering Cancer Center Launches MSKCC India to Expand Access to World-Renowned Oncologists, Cancer Care, Research, and Education.” PR Newswire, 2 August 2021. </w:t>
       </w:r>
-      <w:hyperlink r:id="rId130">
+      <w:hyperlink r:id="rId127">
         <w:r>
           <w:rPr>
             <w:color w:val="1F4E99"/>
@@ -3441,13 +3357,13 @@
           <w:b/>
           <w:color w:val="B31822"/>
         </w:rPr>
-        <w:t>122.</w:t>
+        <w:t>119.</w:t>
         <w:tab/>
       </w:r>
       <w:r>
         <w:t xml:space="preserve">iCliniq. “Frequently Asked Question: MSK India.” </w:t>
       </w:r>
-      <w:hyperlink r:id="rId131">
+      <w:hyperlink r:id="rId128">
         <w:r>
           <w:rPr>
             <w:color w:val="1F4E99"/>
@@ -3469,13 +3385,13 @@
           <w:b/>
           <w:color w:val="B31822"/>
         </w:rPr>
-        <w:t>123.</w:t>
+        <w:t>120.</w:t>
         <w:tab/>
       </w:r>
       <w:r>
         <w:t xml:space="preserve">India Herald. “MD Anderson Cancer Center signs sister institution accord with Tata Memorial.” 17 October 2003. </w:t>
       </w:r>
-      <w:hyperlink r:id="rId132">
+      <w:hyperlink r:id="rId129">
         <w:r>
           <w:rPr>
             <w:color w:val="1F4E99"/>
@@ -3497,13 +3413,13 @@
           <w:b/>
           <w:color w:val="B31822"/>
         </w:rPr>
-        <w:t>124.</w:t>
+        <w:t>121.</w:t>
         <w:tab/>
       </w:r>
       <w:r>
         <w:t xml:space="preserve">The University of Texas MD Anderson Cancer Center. “Project ECHO: Palliative Care Africa (PACA) II.” </w:t>
       </w:r>
-      <w:hyperlink r:id="rId133">
+      <w:hyperlink r:id="rId130">
         <w:r>
           <w:rPr>
             <w:color w:val="1F4E99"/>
@@ -3525,13 +3441,125 @@
           <w:b/>
           <w:color w:val="B31822"/>
         </w:rPr>
+        <w:t>122.</w:t>
+        <w:tab/>
+      </w:r>
+      <w:r>
+        <w:t xml:space="preserve">Mount Sinai Health System. “Ramaiah Memorial Hospital Signs Long Term Collaboration Agreement with the Mount Sinai Health System in New York for Specialty Care Development and Quality and Technological Advancements.” GlobeNewswire via Yahoo Finance, 12 July 2024. </w:t>
+      </w:r>
+      <w:hyperlink r:id="rId131">
+        <w:r>
+          <w:rPr>
+            <w:color w:val="1F4E99"/>
+          </w:rPr>
+          <w:t xml:space="preserve">https://finance.yahoo.com/news/ramaiah-memorial-hospital-signs-long-143000744.html</w:t>
+        </w:r>
+      </w:hyperlink>
+    </w:p>
+    <w:p>
+      <w:pPr>
+        <w:tabs>
+          <w:tab w:pos="567" w:val="left"/>
+        </w:tabs>
+        <w:spacing w:after="120"/>
+        <w:ind w:left="567" w:hanging="567"/>
+      </w:pPr>
+      <w:r>
+        <w:rPr>
+          <w:b/>
+          <w:color w:val="B31822"/>
+        </w:rPr>
+        <w:t>123.</w:t>
+        <w:tab/>
+      </w:r>
+      <w:r>
+        <w:t xml:space="preserve">Mount Sinai Health System. “Ramaiah Memorial Hospital Signs Long Term Collaboration Agreement with the Mount Sinai Health System in New York for Specialty Care Development and Quality and Technological Advancements.” 2024. </w:t>
+      </w:r>
+      <w:hyperlink r:id="rId132">
+        <w:r>
+          <w:rPr>
+            <w:color w:val="1F4E99"/>
+          </w:rPr>
+          <w:t xml:space="preserve">https://www.mountsinai.org/about/newsroom/2024/ramaiah-memorial-hospital-signs-long-term-collaboration-agreement-with-the-mount-sinai-health-system-in-new-york-for-specialty-care-development-and-quality-and-technological-advancements</w:t>
+        </w:r>
+      </w:hyperlink>
+    </w:p>
+    <w:p>
+      <w:pPr>
+        <w:tabs>
+          <w:tab w:pos="567" w:val="left"/>
+        </w:tabs>
+        <w:spacing w:after="120"/>
+        <w:ind w:left="567" w:hanging="567"/>
+      </w:pPr>
+      <w:r>
+        <w:rPr>
+          <w:b/>
+          <w:color w:val="B31822"/>
+        </w:rPr>
+        <w:t>124.</w:t>
+        <w:tab/>
+      </w:r>
+      <w:r>
+        <w:t xml:space="preserve">Deccan Herald. “Ramaiah Memorial inks 10-year partnership with Mount Sinai Health System of New York.” 13 July 2024. </w:t>
+      </w:r>
+      <w:hyperlink r:id="rId133">
+        <w:r>
+          <w:rPr>
+            <w:color w:val="1F4E99"/>
+          </w:rPr>
+          <w:t xml:space="preserve">https://www.deccanherald.com/india/karnataka/bengaluru/ramaiah-memorial-inks-10-year-partnership-with-mount-sinai-health-system-of-new-york-3103995</w:t>
+        </w:r>
+      </w:hyperlink>
+    </w:p>
+    <w:p>
+      <w:pPr>
+        <w:tabs>
+          <w:tab w:pos="567" w:val="left"/>
+        </w:tabs>
+        <w:spacing w:after="120"/>
+        <w:ind w:left="567" w:hanging="567"/>
+      </w:pPr>
+      <w:r>
+        <w:rPr>
+          <w:b/>
+          <w:color w:val="B31822"/>
+        </w:rPr>
         <w:t>125.</w:t>
         <w:tab/>
       </w:r>
       <w:r>
+        <w:t xml:space="preserve">M S Ramaiah Memorial Hospital. “MS Ramaiah Hospital, Bangalore and Mount Sinai Hospital, New York Teams Up.” </w:t>
+      </w:r>
+      <w:hyperlink r:id="rId134">
+        <w:r>
+          <w:rPr>
+            <w:color w:val="1F4E99"/>
+          </w:rPr>
+          <w:t xml:space="preserve">https://msrmh.com/collaborations/</w:t>
+        </w:r>
+      </w:hyperlink>
+    </w:p>
+    <w:p>
+      <w:pPr>
+        <w:tabs>
+          <w:tab w:pos="567" w:val="left"/>
+        </w:tabs>
+        <w:spacing w:after="120"/>
+        <w:ind w:left="567" w:hanging="567"/>
+      </w:pPr>
+      <w:r>
+        <w:rPr>
+          <w:b/>
+          <w:color w:val="B31822"/>
+        </w:rPr>
+        <w:t>126.</w:t>
+        <w:tab/>
+      </w:r>
+      <w:r>
         <w:t xml:space="preserve">UCLA Health, Department of Obstetrics and Gynecology. “UCLA-India Global Health Exchange in OB/GYN.” </w:t>
       </w:r>
-      <w:hyperlink r:id="rId134">
+      <w:hyperlink r:id="rId135">
         <w:r>
           <w:rPr>
             <w:color w:val="1F4E99"/>
@@ -3553,125 +3581,13 @@
           <w:b/>
           <w:color w:val="B31822"/>
         </w:rPr>
-        <w:t>126.</w:t>
-        <w:tab/>
-      </w:r>
-      <w:r>
-        <w:t xml:space="preserve">Mount Sinai Health System. “Ramaiah Memorial Hospital Signs Long Term Collaboration Agreement with the Mount Sinai Health System in New York for Specialty Care Development and Quality and Technological Advancements.” GlobeNewswire via Yahoo Finance, 12 July 2024. </w:t>
-      </w:r>
-      <w:hyperlink r:id="rId135">
-        <w:r>
-          <w:rPr>
-            <w:color w:val="1F4E99"/>
-          </w:rPr>
-          <w:t xml:space="preserve">https://finance.yahoo.com/news/ramaiah-memorial-hospital-signs-long-143000744.html</w:t>
-        </w:r>
-      </w:hyperlink>
-    </w:p>
-    <w:p>
-      <w:pPr>
-        <w:tabs>
-          <w:tab w:pos="567" w:val="left"/>
-        </w:tabs>
-        <w:spacing w:after="120"/>
-        <w:ind w:left="567" w:hanging="567"/>
-      </w:pPr>
-      <w:r>
-        <w:rPr>
-          <w:b/>
-          <w:color w:val="B31822"/>
-        </w:rPr>
         <w:t>127.</w:t>
         <w:tab/>
       </w:r>
       <w:r>
-        <w:t xml:space="preserve">Mount Sinai Health System. “Ramaiah Memorial Hospital Signs Long Term Collaboration Agreement with the Mount Sinai Health System in New York for Specialty Care Development and Quality and Technological Advancements.” 2024. </w:t>
+        <w:t xml:space="preserve">NewYork-Presbyterian. “Disaster Experts from NewYork-Presbyterian Go to India and Sri Lanka to Improve Emergency Preparedness and Response.” 6 November 2008. </w:t>
       </w:r>
       <w:hyperlink r:id="rId136">
-        <w:r>
-          <w:rPr>
-            <w:color w:val="1F4E99"/>
-          </w:rPr>
-          <w:t xml:space="preserve">https://www.mountsinai.org/about/newsroom/2024/ramaiah-memorial-hospital-signs-long-term-collaboration-agreement-with-the-mount-sinai-health-system-in-new-york-for-specialty-care-development-and-quality-and-technological-advancements</w:t>
-        </w:r>
-      </w:hyperlink>
-    </w:p>
-    <w:p>
-      <w:pPr>
-        <w:tabs>
-          <w:tab w:pos="567" w:val="left"/>
-        </w:tabs>
-        <w:spacing w:after="120"/>
-        <w:ind w:left="567" w:hanging="567"/>
-      </w:pPr>
-      <w:r>
-        <w:rPr>
-          <w:b/>
-          <w:color w:val="B31822"/>
-        </w:rPr>
-        <w:t>128.</w:t>
-        <w:tab/>
-      </w:r>
-      <w:r>
-        <w:t xml:space="preserve">Deccan Herald. “Ramaiah Memorial inks 10-year partnership with Mount Sinai Health System of New York.” 13 July 2024. </w:t>
-      </w:r>
-      <w:hyperlink r:id="rId137">
-        <w:r>
-          <w:rPr>
-            <w:color w:val="1F4E99"/>
-          </w:rPr>
-          <w:t xml:space="preserve">https://www.deccanherald.com/india/karnataka/bengaluru/ramaiah-memorial-inks-10-year-partnership-with-mount-sinai-health-system-of-new-york-3103995</w:t>
-        </w:r>
-      </w:hyperlink>
-    </w:p>
-    <w:p>
-      <w:pPr>
-        <w:tabs>
-          <w:tab w:pos="567" w:val="left"/>
-        </w:tabs>
-        <w:spacing w:after="120"/>
-        <w:ind w:left="567" w:hanging="567"/>
-      </w:pPr>
-      <w:r>
-        <w:rPr>
-          <w:b/>
-          <w:color w:val="B31822"/>
-        </w:rPr>
-        <w:t>129.</w:t>
-        <w:tab/>
-      </w:r>
-      <w:r>
-        <w:t xml:space="preserve">M S Ramaiah Memorial Hospital. “MS Ramaiah Hospital, Bangalore and Mount Sinai Hospital, New York Teams Up.” </w:t>
-      </w:r>
-      <w:hyperlink r:id="rId138">
-        <w:r>
-          <w:rPr>
-            <w:color w:val="1F4E99"/>
-          </w:rPr>
-          <w:t xml:space="preserve">https://msrmh.com/collaborations/</w:t>
-        </w:r>
-      </w:hyperlink>
-    </w:p>
-    <w:p>
-      <w:pPr>
-        <w:tabs>
-          <w:tab w:pos="567" w:val="left"/>
-        </w:tabs>
-        <w:spacing w:after="120"/>
-        <w:ind w:left="567" w:hanging="567"/>
-      </w:pPr>
-      <w:r>
-        <w:rPr>
-          <w:b/>
-          <w:color w:val="B31822"/>
-        </w:rPr>
-        <w:t>130.</w:t>
-        <w:tab/>
-      </w:r>
-      <w:r>
-        <w:t xml:space="preserve">NewYork-Presbyterian. “Disaster Experts from NewYork-Presbyterian Go to India and Sri Lanka to Improve Emergency Preparedness and Response.” 6 November 2008. </w:t>
-      </w:r>
-      <w:hyperlink r:id="rId139">
         <w:r>
           <w:rPr>
             <w:color w:val="1F4E99"/>
@@ -3693,13 +3609,13 @@
           <w:b/>
           <w:color w:val="B31822"/>
         </w:rPr>
-        <w:t>131.</w:t>
+        <w:t>128.</w:t>
         <w:tab/>
       </w:r>
       <w:r>
         <w:t xml:space="preserve">UPMC. “Physicians in India access UPMC medical expertise through telemedicine.” EurekAlert!, 21 February 2014. </w:t>
       </w:r>
-      <w:hyperlink r:id="rId140">
+      <w:hyperlink r:id="rId137">
         <w:r>
           <w:rPr>
             <w:color w:val="1F4E99"/>
@@ -3721,13 +3637,13 @@
           <w:b/>
           <w:color w:val="B31822"/>
         </w:rPr>
-        <w:t>132.</w:t>
+        <w:t>129.</w:t>
         <w:tab/>
       </w:r>
       <w:r>
         <w:t xml:space="preserve">UPMC International. “Locations and Partnerships.” </w:t>
       </w:r>
-      <w:hyperlink r:id="rId141">
+      <w:hyperlink r:id="rId138">
         <w:r>
           <w:rPr>
             <w:color w:val="1F4E99"/>
@@ -3749,18 +3665,102 @@
           <w:b/>
           <w:color w:val="B31822"/>
         </w:rPr>
+        <w:t>130.</w:t>
+        <w:tab/>
+      </w:r>
+      <w:r>
+        <w:t xml:space="preserve">Harvard Magazine. “At Harvard Medical International, Changes Afoot.” Harvard Magazine, January 2008. </w:t>
+      </w:r>
+      <w:hyperlink r:id="rId139">
+        <w:r>
+          <w:rPr>
+            <w:color w:val="1F4E99"/>
+          </w:rPr>
+          <w:t xml:space="preserve">https://www.harvardmagazine.com/2008/01/harvard-medical</w:t>
+        </w:r>
+      </w:hyperlink>
+    </w:p>
+    <w:p>
+      <w:pPr>
+        <w:tabs>
+          <w:tab w:pos="567" w:val="left"/>
+        </w:tabs>
+        <w:spacing w:after="120"/>
+        <w:ind w:left="567" w:hanging="567"/>
+      </w:pPr>
+      <w:r>
+        <w:rPr>
+          <w:b/>
+          <w:color w:val="B31822"/>
+        </w:rPr>
+        <w:t>131.</w:t>
+        <w:tab/>
+      </w:r>
+      <w:r>
+        <w:t xml:space="preserve">Harvard Gazette. “Partners HealthCare to assume management of Harvard Medical International.” Harvard University, 24 April 2008. </w:t>
+      </w:r>
+      <w:hyperlink r:id="rId140">
+        <w:r>
+          <w:rPr>
+            <w:color w:val="1F4E99"/>
+          </w:rPr>
+          <w:t xml:space="preserve">https://news.harvard.edu/gazette/story/2008/04/partners-healthcare-to-assume-management-of-harvard-medical-international/</w:t>
+        </w:r>
+      </w:hyperlink>
+    </w:p>
+    <w:p>
+      <w:pPr>
+        <w:tabs>
+          <w:tab w:pos="567" w:val="left"/>
+        </w:tabs>
+        <w:spacing w:after="120"/>
+        <w:ind w:left="567" w:hanging="567"/>
+      </w:pPr>
+      <w:r>
+        <w:rPr>
+          <w:b/>
+          <w:color w:val="B31822"/>
+        </w:rPr>
+        <w:t>132.</w:t>
+        <w:tab/>
+      </w:r>
+      <w:r>
+        <w:t xml:space="preserve">WBUR News. “Brand-Aid: Hospital Giant Partners HealthCare Is Changing Names.” WBUR, 27 November 2019. </w:t>
+      </w:r>
+      <w:hyperlink r:id="rId141">
+        <w:r>
+          <w:rPr>
+            <w:color w:val="1F4E99"/>
+          </w:rPr>
+          <w:t xml:space="preserve">https://www.wbur.org/news/2019/11/27/partners-mass-general-brigham-hospitals</w:t>
+        </w:r>
+      </w:hyperlink>
+    </w:p>
+    <w:p>
+      <w:pPr>
+        <w:tabs>
+          <w:tab w:pos="567" w:val="left"/>
+        </w:tabs>
+        <w:spacing w:after="120"/>
+        <w:ind w:left="567" w:hanging="567"/>
+      </w:pPr>
+      <w:r>
+        <w:rPr>
+          <w:b/>
+          <w:color w:val="B31822"/>
+        </w:rPr>
         <w:t>133.</w:t>
         <w:tab/>
       </w:r>
       <w:r>
-        <w:t xml:space="preserve">Wikipedia contributors. “Partners Harvard Medical International.” Wikipedia. </w:t>
+        <w:t xml:space="preserve">Wockhardt Limited. “Annual Report 2010-11.” </w:t>
       </w:r>
       <w:hyperlink r:id="rId142">
         <w:r>
           <w:rPr>
             <w:color w:val="1F4E99"/>
           </w:rPr>
-          <w:t xml:space="preserve">https://en.wikipedia.org/wiki/Partners_Harvard_Medical_International</w:t>
+          <w:t xml:space="preserve">https://www.wockhardt.com/wp-content/uploads/2022/08/annual-report-2010-11-53a4d.pdf</w:t>
         </w:r>
       </w:hyperlink>
     </w:p>
@@ -3781,14 +3781,14 @@
         <w:tab/>
       </w:r>
       <w:r>
-        <w:t xml:space="preserve">Wockhardt Limited. “Annual Report 2010-11.” </w:t>
+        <w:t xml:space="preserve">Mass General Brigham. “Global Partnerships.” </w:t>
       </w:r>
       <w:hyperlink r:id="rId143">
         <w:r>
           <w:rPr>
             <w:color w:val="1F4E99"/>
           </w:rPr>
-          <w:t xml:space="preserve">https://www.wockhardt.com/wp-content/uploads/2022/08/annual-report-2010-11-53a4d.pdf</w:t>
+          <w:t xml:space="preserve">https://www.massgeneralbrigham.org/en/about/members-affiliates/global-partnerships</w:t>
         </w:r>
       </w:hyperlink>
     </w:p>
@@ -3865,37 +3865,9 @@
         <w:tab/>
       </w:r>
       <w:r>
-        <w:t xml:space="preserve">Mass General Brigham. “Global Partnerships.” </w:t>
+        <w:t xml:space="preserve">Medicover. “Medicover divests its India hospital business, enabling accelerated strategy execution in Europe.” Modular Finance via TradingView, 6 August 2026. </w:t>
       </w:r>
       <w:hyperlink r:id="rId146">
-        <w:r>
-          <w:rPr>
-            <w:color w:val="1F4E99"/>
-          </w:rPr>
-          <w:t xml:space="preserve">https://www.massgeneralbrigham.org/en/about/members-affiliates/global-partnerships</w:t>
-        </w:r>
-      </w:hyperlink>
-    </w:p>
-    <w:p>
-      <w:pPr>
-        <w:tabs>
-          <w:tab w:pos="567" w:val="left"/>
-        </w:tabs>
-        <w:spacing w:after="120"/>
-        <w:ind w:left="567" w:hanging="567"/>
-      </w:pPr>
-      <w:r>
-        <w:rPr>
-          <w:b/>
-          <w:color w:val="B31822"/>
-        </w:rPr>
-        <w:t>138.</w:t>
-        <w:tab/>
-      </w:r>
-      <w:r>
-        <w:t xml:space="preserve">Medicover. “Medicover divests its India hospital business, enabling accelerated strategy execution in Europe.” Modular Finance via TradingView, 6 August 2026. </w:t>
-      </w:r>
-      <w:hyperlink r:id="rId147">
         <w:r>
           <w:rPr>
             <w:color w:val="1F4E99"/>
@@ -3917,13 +3889,13 @@
           <w:b/>
           <w:color w:val="B31822"/>
         </w:rPr>
-        <w:t>139.</w:t>
+        <w:t>138.</w:t>
         <w:tab/>
       </w:r>
       <w:r>
         <w:t xml:space="preserve">King's College London. “New partnership to improve healthcare outcomes in India and the UK.” 24 April 2024. </w:t>
       </w:r>
-      <w:hyperlink r:id="rId148">
+      <w:hyperlink r:id="rId147">
         <w:r>
           <w:rPr>
             <w:color w:val="1F4E99"/>
@@ -3945,13 +3917,13 @@
           <w:b/>
           <w:color w:val="B31822"/>
         </w:rPr>
-        <w:t>140.</w:t>
+        <w:t>139.</w:t>
         <w:tab/>
       </w:r>
       <w:r>
         <w:t xml:space="preserve">P. D. Hinduja Hospital. “King's College London and Guy's and St Thomas' NHS Foundation Trust, with P. D. Hinduja Hospital and the Hinduja Foundation establish a Health Partners Academy.” 24 April 2024. </w:t>
       </w:r>
-      <w:hyperlink r:id="rId149">
+      <w:hyperlink r:id="rId148">
         <w:r>
           <w:rPr>
             <w:color w:val="1F4E99"/>
@@ -3973,41 +3945,13 @@
           <w:b/>
           <w:color w:val="B31822"/>
         </w:rPr>
-        <w:t>141.</w:t>
+        <w:t>140.</w:t>
         <w:tab/>
       </w:r>
       <w:r>
-        <w:t xml:space="preserve">Outlook Money. “West Bengal Set For Ayushman Bharat Rollout, State To Sign MoU With NHA On June 8.” 8 June 2026. </w:t>
-      </w:r>
-      <w:hyperlink r:id="rId150">
-        <w:r>
-          <w:rPr>
-            <w:color w:val="1F4E99"/>
-          </w:rPr>
-          <w:t xml:space="preserve">https://www.outlookmoney.com/personal-finance/west-bengal-set-for-ayushman-bharat-rollout-state-to-sign-mou-with-nha-on-june-8</w:t>
-        </w:r>
-      </w:hyperlink>
-    </w:p>
-    <w:p>
-      <w:pPr>
-        <w:tabs>
-          <w:tab w:pos="567" w:val="left"/>
-        </w:tabs>
-        <w:spacing w:after="120"/>
-        <w:ind w:left="567" w:hanging="567"/>
-      </w:pPr>
-      <w:r>
-        <w:rPr>
-          <w:b/>
-          <w:color w:val="B31822"/>
-        </w:rPr>
-        <w:t>142.</w:t>
-        <w:tab/>
-      </w:r>
-      <w:r>
         <w:t xml:space="preserve">DD News. “West Bengal joins Ayushman Bharat PM-JAY, completing nationwide rollout of world's largest health assurance scheme.” 8 June 2026. </w:t>
       </w:r>
-      <w:hyperlink r:id="rId151">
+      <w:hyperlink r:id="rId149">
         <w:r>
           <w:rPr>
             <w:color w:val="1F4E99"/>
@@ -4029,13 +3973,13 @@
           <w:b/>
           <w:color w:val="B31822"/>
         </w:rPr>
-        <w:t>143.</w:t>
+        <w:t>141.</w:t>
         <w:tab/>
       </w:r>
       <w:r>
         <w:t xml:space="preserve">Deccan Herald. “Maharashtra signs MoU with Cleveland Clinic-led consortium for $1.2 billion Navi Mumbai MediCity.” 10 June 2026. </w:t>
       </w:r>
-      <w:hyperlink r:id="rId152">
+      <w:hyperlink r:id="rId150">
         <w:r>
           <w:rPr>
             <w:color w:val="1F4E99"/>
@@ -4057,13 +4001,13 @@
           <w:b/>
           <w:color w:val="B31822"/>
         </w:rPr>
-        <w:t>144.</w:t>
+        <w:t>142.</w:t>
         <w:tab/>
       </w:r>
       <w:r>
         <w:t xml:space="preserve">BusinessToday. “Manipal Health Enterprises makes solid stock market debut; shares list at 11% premium.” 5 August 2026. </w:t>
       </w:r>
-      <w:hyperlink r:id="rId153">
+      <w:hyperlink r:id="rId151">
         <w:r>
           <w:rPr>
             <w:color w:val="1F4E99"/>
@@ -4085,13 +4029,13 @@
           <w:b/>
           <w:color w:val="B31822"/>
         </w:rPr>
-        <w:t>145.</w:t>
+        <w:t>143.</w:t>
         <w:tab/>
       </w:r>
       <w:r>
         <w:t xml:space="preserve">Business Standard. “KKR pumps Rs 13,188 cr into India expansion, acquires Medicover hospitals.” 6 August 2026. </w:t>
       </w:r>
-      <w:hyperlink r:id="rId154">
+      <w:hyperlink r:id="rId152">
         <w:r>
           <w:rPr>
             <w:color w:val="1F4E99"/>
@@ -4113,13 +4057,13 @@
           <w:b/>
           <w:color w:val="B31822"/>
         </w:rPr>
-        <w:t>146.</w:t>
+        <w:t>144.</w:t>
         <w:tab/>
       </w:r>
       <w:r>
         <w:t xml:space="preserve">ANI. “Ayushman Bharat completes 8 years with health cover of Rs 5 lakh to over 12 crore families: NHA CEO.” India Gazette. </w:t>
       </w:r>
-      <w:hyperlink r:id="rId155">
+      <w:hyperlink r:id="rId153">
         <w:r>
           <w:rPr>
             <w:color w:val="1F4E99"/>

</xml_diff>

<commit_message>
India: partnerships map; competitor section and summary now read from the verified tracker
Map shows active and unclear partnerships by city with the largest metros
highlighted. Profile's per-institution paragraphs replaced by the map and a
tracker-driven table; summary's competitor table replaced by the map.

Co-Authored-By: Claude Opus 5.5 <noreply@anthropic.com>
Claude-Session: https://claude.ai/code/session_01ChEN58PbdXFZmwUoBZYBRb
</commit_message>
<xml_diff>
--- a/output/India_Profile_DRAFT_SOURCES.docx
+++ b/output/India_Profile_DRAFT_SOURCES.docx
@@ -3025,14 +3025,14 @@
         <w:tab/>
       </w:r>
       <w:r>
-        <w:t xml:space="preserve">Mayo Clinic. “AIG Hospitals in India joins Mayo Clinic Care Network.” Newswise, 24 October 2019. </w:t>
+        <w:t xml:space="preserve">Children's HeartLink. “From Philadelphia to Faridabad, This Hospital Partnership Is Transforming Heart Care for Children in India.” Children's HeartLink, 2024-10-15. </w:t>
       </w:r>
       <w:hyperlink r:id="rId116">
         <w:r>
           <w:rPr>
             <w:color w:val="1F4E99"/>
           </w:rPr>
-          <w:t xml:space="preserve">https://www.newswise.com/articles/aig-hospitals-in-india-joins-mayo-clinic-care-network</w:t>
+          <w:t xml:space="preserve">https://childrensheartlink.org/from-philadelphia-to-faridabad-this-hospital-partnership-is-transforming-heart-care-for-children-in-india/</w:t>
         </w:r>
       </w:hyperlink>
     </w:p>
@@ -3053,14 +3053,14 @@
         <w:tab/>
       </w:r>
       <w:r>
-        <w:t xml:space="preserve">Mayo Clinic. “AIG Hospitals in India joins Mayo Clinic Care Network.” Mayo Clinic News Network, 24 October 2019. </w:t>
+        <w:t xml:space="preserve">Myra C. Nwafor. “Emory students propose innovative solutions to diabetes care in India.” Emory News Center, 2025-05-13. </w:t>
       </w:r>
       <w:hyperlink r:id="rId117">
         <w:r>
           <w:rPr>
             <w:color w:val="1F4E99"/>
           </w:rPr>
-          <w:t xml:space="preserve">https://newsnetwork.mayoclinic.org/discussion/aig-hospitals-in-india-joins-mayo-clinic-care-network/</w:t>
+          <w:t xml:space="preserve">https://news.emory.edu/stories/2025/05/hs_diabetes_care_india_13-05-2025/story.html</w:t>
         </w:r>
       </w:hyperlink>
     </w:p>
@@ -3081,9 +3081,681 @@
         <w:tab/>
       </w:r>
       <w:r>
-        <w:t xml:space="preserve">Post Bulletin. “Billionaire to partner with Mayo Clinic on India hospitals.” 11 February 2025. </w:t>
+        <w:t xml:space="preserve">Hackensack Meridian Health. “Hackensack Meridian Health and Apollo Hospitals Bridge Continents to Advance Healthcare Innovation and Delivery.” Hackensack Meridian Health, 2025-01-29. </w:t>
       </w:r>
       <w:hyperlink r:id="rId118">
+        <w:r>
+          <w:rPr>
+            <w:color w:val="1F4E99"/>
+          </w:rPr>
+          <w:t xml:space="preserve">https://www.hackensackmeridianhealth.org/en/news/2025/01/29/hmh-and-apollo-hospitals-bridge-continents-to-advance-healthcare</w:t>
+        </w:r>
+      </w:hyperlink>
+    </w:p>
+    <w:p>
+      <w:pPr>
+        <w:tabs>
+          <w:tab w:pos="567" w:val="left"/>
+        </w:tabs>
+        <w:spacing w:after="120"/>
+        <w:ind w:left="567" w:hanging="567"/>
+      </w:pPr>
+      <w:r>
+        <w:rPr>
+          <w:b/>
+          <w:color w:val="B31822"/>
+        </w:rPr>
+        <w:t>110.</w:t>
+        <w:tab/>
+      </w:r>
+      <w:r>
+        <w:t xml:space="preserve">Forbes India. “From beginning to end of life: Ajit and Sarah Isaac fill in the blanks.” Forbes India, 6 April 2026. </w:t>
+      </w:r>
+      <w:hyperlink r:id="rId119">
+        <w:r>
+          <w:rPr>
+            <w:color w:val="1F4E99"/>
+          </w:rPr>
+          <w:t xml:space="preserve">https://www.forbesindia.com/article/leadership/from-beginning-to-end-of-life-ajit-and-sarah-isaac-fill-in-the-blanks/2992863/1</w:t>
+        </w:r>
+      </w:hyperlink>
+    </w:p>
+    <w:p>
+      <w:pPr>
+        <w:tabs>
+          <w:tab w:pos="567" w:val="left"/>
+        </w:tabs>
+        <w:spacing w:after="120"/>
+        <w:ind w:left="567" w:hanging="567"/>
+      </w:pPr>
+      <w:r>
+        <w:rPr>
+          <w:b/>
+          <w:color w:val="B31822"/>
+        </w:rPr>
+        <w:t>111.</w:t>
+        <w:tab/>
+      </w:r>
+      <w:r>
+        <w:t xml:space="preserve">HATHI study authors (Johns Hopkins University; Dr. D.Y. Patil Medical College, Hospital and Research Centre; BJGMC and others). “Hybrid trial for Alcohol reduction among people with TB and HIV in India (HATHI): Protocol for a Hybrid Type 1 Effectiveness-Implementation Randomized Controlled Trial.” Research Square (PubMed 41928807), 25 March 2026. </w:t>
+      </w:r>
+      <w:hyperlink r:id="rId120">
+        <w:r>
+          <w:rPr>
+            <w:color w:val="1F4E99"/>
+          </w:rPr>
+          <w:t xml:space="preserve">https://pubmed.ncbi.nlm.nih.gov/41928807/</w:t>
+        </w:r>
+      </w:hyperlink>
+    </w:p>
+    <w:p>
+      <w:pPr>
+        <w:tabs>
+          <w:tab w:pos="567" w:val="left"/>
+        </w:tabs>
+        <w:spacing w:after="120"/>
+        <w:ind w:left="567" w:hanging="567"/>
+      </w:pPr>
+      <w:r>
+        <w:rPr>
+          <w:b/>
+          <w:color w:val="B31822"/>
+        </w:rPr>
+        <w:t>112.</w:t>
+        <w:tab/>
+      </w:r>
+      <w:r>
+        <w:t xml:space="preserve">Gupta-Klinsky India Institute. “News from GKII 2025 (launch of 2025-26 GKII-KCDH Data Science and AI Breakthrough Research Grants).” Johns Hopkins University, December 2025. </w:t>
+      </w:r>
+      <w:hyperlink r:id="rId121">
+        <w:r>
+          <w:rPr>
+            <w:color w:val="1F4E99"/>
+          </w:rPr>
+          <w:t xml:space="preserve">https://indiainstitute.jhu.edu/news/news-2025/news-from-gkii-2025/</w:t>
+        </w:r>
+      </w:hyperlink>
+    </w:p>
+    <w:p>
+      <w:pPr>
+        <w:tabs>
+          <w:tab w:pos="567" w:val="left"/>
+        </w:tabs>
+        <w:spacing w:after="120"/>
+        <w:ind w:left="567" w:hanging="567"/>
+      </w:pPr>
+      <w:r>
+        <w:rPr>
+          <w:b/>
+          <w:color w:val="B31822"/>
+        </w:rPr>
+        <w:t>113.</w:t>
+        <w:tab/>
+      </w:r>
+      <w:r>
+        <w:t xml:space="preserve">BJGMC, Weill Cornell Medicine and Johns Hopkins authors. “Dolutegravir Is Associated With Lower Odds of Gestational Diabetes Compared to Other Antiretroviral Therapy Regimens Among Pregnant Women in India: A Cross-Sectional Analysis.” Journal of the International AIDS Society (PubMed 42764545), 1 September 2026. </w:t>
+      </w:r>
+      <w:hyperlink r:id="rId122">
+        <w:r>
+          <w:rPr>
+            <w:color w:val="1F4E99"/>
+          </w:rPr>
+          <w:t xml:space="preserve">https://pubmed.ncbi.nlm.nih.gov/42764545/</w:t>
+        </w:r>
+      </w:hyperlink>
+    </w:p>
+    <w:p>
+      <w:pPr>
+        <w:tabs>
+          <w:tab w:pos="567" w:val="left"/>
+        </w:tabs>
+        <w:spacing w:after="120"/>
+        <w:ind w:left="567" w:hanging="567"/>
+      </w:pPr>
+      <w:r>
+        <w:rPr>
+          <w:b/>
+          <w:color w:val="B31822"/>
+        </w:rPr>
+        <w:t>114.</w:t>
+        <w:tab/>
+      </w:r>
+      <w:r>
+        <w:t xml:space="preserve">OncoDaily. “Joint session by MD Anderson Cancer Center and Tata Memorial Centre at SACT 2025 Summit.” OncoDaily, 4 December 2024. </w:t>
+      </w:r>
+      <w:hyperlink r:id="rId123">
+        <w:r>
+          <w:rPr>
+            <w:color w:val="1F4E99"/>
+          </w:rPr>
+          <w:t xml:space="preserve">https://oncodaily.com/blog/md-anderson-cancer-center-197733</w:t>
+        </w:r>
+      </w:hyperlink>
+    </w:p>
+    <w:p>
+      <w:pPr>
+        <w:tabs>
+          <w:tab w:pos="567" w:val="left"/>
+        </w:tabs>
+        <w:spacing w:after="120"/>
+        <w:ind w:left="567" w:hanging="567"/>
+      </w:pPr>
+      <w:r>
+        <w:rPr>
+          <w:b/>
+          <w:color w:val="B31822"/>
+        </w:rPr>
+        <w:t>115.</w:t>
+        <w:tab/>
+      </w:r>
+      <w:r>
+        <w:t xml:space="preserve">AIIMS New Delhi. “AIIMS Mayo Clinic Update in Kidney Diseases and Transplant 2024.” Event website, 7-8 December 2024. </w:t>
+      </w:r>
+      <w:hyperlink r:id="rId124">
+        <w:r>
+          <w:rPr>
+            <w:color w:val="1F4E99"/>
+          </w:rPr>
+          <w:t xml:space="preserve">https://aiimsmayoclinicupdate2024.com/</w:t>
+        </w:r>
+      </w:hyperlink>
+    </w:p>
+    <w:p>
+      <w:pPr>
+        <w:tabs>
+          <w:tab w:pos="567" w:val="left"/>
+        </w:tabs>
+        <w:spacing w:after="120"/>
+        <w:ind w:left="567" w:hanging="567"/>
+      </w:pPr>
+      <w:r>
+        <w:rPr>
+          <w:b/>
+          <w:color w:val="B31822"/>
+        </w:rPr>
+        <w:t>116.</w:t>
+        <w:tab/>
+      </w:r>
+      <w:r>
+        <w:t xml:space="preserve">Digital Health News. “Adani Group to Set Up INR 2,500 Crore Health City in West Bengal with Mayo Clinic Collaboration.” Digital Health News, 6 July 2026. </w:t>
+      </w:r>
+      <w:hyperlink r:id="rId125">
+        <w:r>
+          <w:rPr>
+            <w:color w:val="1F4E99"/>
+          </w:rPr>
+          <w:t xml:space="preserve">https://www.digitalhealthnews.com/adani-group-to-invest-inr-2-500-cr-in-health-city-project-in-west-bengal</w:t>
+        </w:r>
+      </w:hyperlink>
+    </w:p>
+    <w:p>
+      <w:pPr>
+        <w:tabs>
+          <w:tab w:pos="567" w:val="left"/>
+        </w:tabs>
+        <w:spacing w:after="120"/>
+        <w:ind w:left="567" w:hanging="567"/>
+      </w:pPr>
+      <w:r>
+        <w:rPr>
+          <w:b/>
+          <w:color w:val="B31822"/>
+        </w:rPr>
+        <w:t>117.</w:t>
+        <w:tab/>
+      </w:r>
+      <w:r>
+        <w:t xml:space="preserve">The Indian Practitioner. “Lilavati Expands Globally and Domestically with Mauritius, GIFT City Projects.” The Indian Practitioner, 22 April 2026. </w:t>
+      </w:r>
+      <w:hyperlink r:id="rId126">
+        <w:r>
+          <w:rPr>
+            <w:color w:val="1F4E99"/>
+          </w:rPr>
+          <w:t xml:space="preserve">https://theindianpractitioner.com/lilavati-expands-globally-and-domestically-with-mauritius-gift-city-projects/</w:t>
+        </w:r>
+      </w:hyperlink>
+    </w:p>
+    <w:p>
+      <w:pPr>
+        <w:tabs>
+          <w:tab w:pos="567" w:val="left"/>
+        </w:tabs>
+        <w:spacing w:after="120"/>
+        <w:ind w:left="567" w:hanging="567"/>
+      </w:pPr>
+      <w:r>
+        <w:rPr>
+          <w:b/>
+          <w:color w:val="B31822"/>
+        </w:rPr>
+        <w:t>118.</w:t>
+        <w:tab/>
+      </w:r>
+      <w:r>
+        <w:t xml:space="preserve">Lilavati Hospital. “News and Media.” Lilavati Hospital, 23 September 2025. </w:t>
+      </w:r>
+      <w:hyperlink r:id="rId127">
+        <w:r>
+          <w:rPr>
+            <w:color w:val="1F4E99"/>
+          </w:rPr>
+          <w:t xml:space="preserve">https://www.lilavati-hospital.com/news-and-media.php</w:t>
+        </w:r>
+      </w:hyperlink>
+    </w:p>
+    <w:p>
+      <w:pPr>
+        <w:tabs>
+          <w:tab w:pos="567" w:val="left"/>
+        </w:tabs>
+        <w:spacing w:after="120"/>
+        <w:ind w:left="567" w:hanging="567"/>
+      </w:pPr>
+      <w:r>
+        <w:rPr>
+          <w:b/>
+          <w:color w:val="B31822"/>
+        </w:rPr>
+        <w:t>119.</w:t>
+        <w:tab/>
+      </w:r>
+      <w:r>
+        <w:t xml:space="preserve">ANI. “Ramaiah Memorial Hospital Brings 700+ Citizens Together to Put Heart Health in Motion.” Business Standard, 28 September 2026. </w:t>
+      </w:r>
+      <w:hyperlink r:id="rId128">
+        <w:r>
+          <w:rPr>
+            <w:color w:val="1F4E99"/>
+          </w:rPr>
+          <w:t xml:space="preserve">https://www.business-standard.com/amp/content/press-releases-ani/ramaiah-memorial-hospital-brings-700-citizens-together-to-put-heart-health-in-motion-126092801082_1.html</w:t>
+        </w:r>
+      </w:hyperlink>
+    </w:p>
+    <w:p>
+      <w:pPr>
+        <w:tabs>
+          <w:tab w:pos="567" w:val="left"/>
+        </w:tabs>
+        <w:spacing w:after="120"/>
+        <w:ind w:left="567" w:hanging="567"/>
+      </w:pPr>
+      <w:r>
+        <w:rPr>
+          <w:b/>
+          <w:color w:val="B31822"/>
+        </w:rPr>
+        <w:t>120.</w:t>
+        <w:tab/>
+      </w:r>
+      <w:r>
+        <w:t xml:space="preserve">Choose New Jersey. “Governor Murphy Celebrates Signing of MOUs Between New Jersey and Indian Universities, Hospitals to Advance Cardiovascular Research and Innovation.” Insider NJ, 2025-09-19. </w:t>
+      </w:r>
+      <w:hyperlink r:id="rId129">
+        <w:r>
+          <w:rPr>
+            <w:color w:val="1F4E99"/>
+          </w:rPr>
+          <w:t xml:space="preserve">https://www.insidernj.com/press-release/governor-murphy-celebrates-signing-of-mous-between-new-jersey-and-indian-universities-hospitals-to-advance-cardiovascular-research-and-innovation/</w:t>
+        </w:r>
+      </w:hyperlink>
+    </w:p>
+    <w:p>
+      <w:pPr>
+        <w:tabs>
+          <w:tab w:pos="567" w:val="left"/>
+        </w:tabs>
+        <w:spacing w:after="120"/>
+        <w:ind w:left="567" w:hanging="567"/>
+      </w:pPr>
+      <w:r>
+        <w:rPr>
+          <w:b/>
+          <w:color w:val="B31822"/>
+        </w:rPr>
+        <w:t>121.</w:t>
+        <w:tab/>
+      </w:r>
+      <w:r>
+        <w:t xml:space="preserve">Jake Mickelsen. “Learn how a quality improvement program is improving care for cancer patients across India.” Stanford Global Health, 2025-04-18. </w:t>
+      </w:r>
+      <w:hyperlink r:id="rId130">
+        <w:r>
+          <w:rPr>
+            <w:color w:val="1F4E99"/>
+          </w:rPr>
+          <w:t xml:space="preserve">https://globalhealth.stanford.edu/bidirectional-partnerships/9912.html/</w:t>
+        </w:r>
+      </w:hyperlink>
+    </w:p>
+    <w:p>
+      <w:pPr>
+        <w:tabs>
+          <w:tab w:pos="567" w:val="left"/>
+        </w:tabs>
+        <w:spacing w:after="120"/>
+        <w:ind w:left="567" w:hanging="567"/>
+      </w:pPr>
+      <w:r>
+        <w:rPr>
+          <w:b/>
+          <w:color w:val="B31822"/>
+        </w:rPr>
+        <w:t>122.</w:t>
+        <w:tab/>
+      </w:r>
+      <w:r>
+        <w:t xml:space="preserve">Stanford Center for Innovation in Global Health. “Longtime global emergency medicine collaborators from India's Emergency Management and Research Institute visit Stanford.” Stanford Global Health, 2025-06-17. </w:t>
+      </w:r>
+      <w:hyperlink r:id="rId131">
+        <w:r>
+          <w:rPr>
+            <w:color w:val="1F4E99"/>
+          </w:rPr>
+          <w:t xml:space="preserve">https://globalhealth.stanford.edu/bidirectional-parnterships/longtime-global-emergency-medicine-collaborators-from-indias-emergency-management-and-research-institute-visit-stanford.html/</w:t>
+        </w:r>
+      </w:hyperlink>
+    </w:p>
+    <w:p>
+      <w:pPr>
+        <w:tabs>
+          <w:tab w:pos="567" w:val="left"/>
+        </w:tabs>
+        <w:spacing w:after="120"/>
+        <w:ind w:left="567" w:hanging="567"/>
+      </w:pPr>
+      <w:r>
+        <w:rPr>
+          <w:b/>
+          <w:color w:val="B31822"/>
+        </w:rPr>
+        <w:t>123.</w:t>
+        <w:tab/>
+      </w:r>
+      <w:r>
+        <w:t xml:space="preserve">KLE J N Medical College and Thomas Jefferson University authors. “Response of reticulocyte and red blood cell indices to single-dose intravenous iron in pregnant women with moderate iron deficiency anemia: secondary analysis of the RAPIDIRON trial.” Journal of Maternal-Fetal and Neonatal Medicine (PubMed 42045095), 27 April 2026. </w:t>
+      </w:r>
+      <w:hyperlink r:id="rId132">
+        <w:r>
+          <w:rPr>
+            <w:color w:val="1F4E99"/>
+          </w:rPr>
+          <w:t xml:space="preserve">https://pubmed.ncbi.nlm.nih.gov/42045095/</w:t>
+        </w:r>
+      </w:hyperlink>
+    </w:p>
+    <w:p>
+      <w:pPr>
+        <w:tabs>
+          <w:tab w:pos="567" w:val="left"/>
+        </w:tabs>
+        <w:spacing w:after="120"/>
+        <w:ind w:left="567" w:hanging="567"/>
+      </w:pPr>
+      <w:r>
+        <w:rPr>
+          <w:b/>
+          <w:color w:val="B31822"/>
+        </w:rPr>
+        <w:t>124.</w:t>
+        <w:tab/>
+      </w:r>
+      <w:r>
+        <w:t xml:space="preserve">UCLA Health Department of Obstetrics and Gynecology. “Newsletter Summer 2025: New and Noteworthy.” UCLA Health, Summer 2025. </w:t>
+      </w:r>
+      <w:hyperlink r:id="rId133">
+        <w:r>
+          <w:rPr>
+            <w:color w:val="1F4E99"/>
+          </w:rPr>
+          <w:t xml:space="preserve">https://www.uclahealth.org/departments/obgyn/about-us/news/newsletter-summer-2025/new-and-noteworthy</w:t>
+        </w:r>
+      </w:hyperlink>
+    </w:p>
+    <w:p>
+      <w:pPr>
+        <w:tabs>
+          <w:tab w:pos="567" w:val="left"/>
+        </w:tabs>
+        <w:spacing w:after="120"/>
+        <w:ind w:left="567" w:hanging="567"/>
+      </w:pPr>
+      <w:r>
+        <w:rPr>
+          <w:b/>
+          <w:color w:val="B31822"/>
+        </w:rPr>
+        <w:t>125.</w:t>
+        <w:tab/>
+      </w:r>
+      <w:r>
+        <w:t xml:space="preserve">UCLA Health. “UCLA OB/GYN global health initiatives spark learning, innovation and training.” UCLA Health, 8 December 2025. </w:t>
+      </w:r>
+      <w:hyperlink r:id="rId134">
+        <w:r>
+          <w:rPr>
+            <w:color w:val="1F4E99"/>
+          </w:rPr>
+          <w:t xml:space="preserve">https://www.uclahealth.org/news/article/ucla-obgyn-global-health-initiatives-spark-learning</w:t>
+        </w:r>
+      </w:hyperlink>
+    </w:p>
+    <w:p>
+      <w:pPr>
+        <w:tabs>
+          <w:tab w:pos="567" w:val="left"/>
+        </w:tabs>
+        <w:spacing w:after="120"/>
+        <w:ind w:left="567" w:hanging="567"/>
+      </w:pPr>
+      <w:r>
+        <w:rPr>
+          <w:b/>
+          <w:color w:val="B31822"/>
+        </w:rPr>
+        <w:t>126.</w:t>
+        <w:tab/>
+      </w:r>
+      <w:r>
+        <w:t xml:space="preserve">Shawna Masters. “New UAB-India partnership aims to enhance global health training.” UAB Medicine, 2025-07-29. </w:t>
+      </w:r>
+      <w:hyperlink r:id="rId135">
+        <w:r>
+          <w:rPr>
+            <w:color w:val="1F4E99"/>
+          </w:rPr>
+          <w:t xml:space="preserve">https://www.uab.edu/medicine/news/global-health/new-uab-india-partnership-aims-to-enhance-global-health-training</w:t>
+        </w:r>
+      </w:hyperlink>
+    </w:p>
+    <w:p>
+      <w:pPr>
+        <w:tabs>
+          <w:tab w:pos="567" w:val="left"/>
+        </w:tabs>
+        <w:spacing w:after="120"/>
+        <w:ind w:left="567" w:hanging="567"/>
+      </w:pPr>
+      <w:r>
+        <w:rPr>
+          <w:b/>
+          <w:color w:val="B31822"/>
+        </w:rPr>
+        <w:t>127.</w:t>
+        <w:tab/>
+      </w:r>
+      <w:r>
+        <w:t xml:space="preserve">REAGIR trial authors (Aravind Eye Hospital; Francis I. Proctor Foundation, UCSF and others). “Rose Bengal Electromagnetic Activation With Green Light for Infection Reduction: Follow-Up of a Randomized Clinical Trial.” JAMA Ophthalmology (PubMed 42348235), 1 August 2026. </w:t>
+      </w:r>
+      <w:hyperlink r:id="rId136">
+        <w:r>
+          <w:rPr>
+            <w:color w:val="1F4E99"/>
+          </w:rPr>
+          <w:t xml:space="preserve">https://pubmed.ncbi.nlm.nih.gov/42348235/</w:t>
+        </w:r>
+      </w:hyperlink>
+    </w:p>
+    <w:p>
+      <w:pPr>
+        <w:tabs>
+          <w:tab w:pos="567" w:val="left"/>
+        </w:tabs>
+        <w:spacing w:after="120"/>
+        <w:ind w:left="567" w:hanging="567"/>
+      </w:pPr>
+      <w:r>
+        <w:rPr>
+          <w:b/>
+          <w:color w:val="B31822"/>
+        </w:rPr>
+        <w:t>128.</w:t>
+        <w:tab/>
+      </w:r>
+      <w:r>
+        <w:t xml:space="preserve">Iowa Lions Eye Bank. “Iowa Lions Eye Bank Shares Expertise with Corneal Specialists in India.” Iowa Lions Eye Bank, 1 February 2025. </w:t>
+      </w:r>
+      <w:hyperlink r:id="rId137">
+        <w:r>
+          <w:rPr>
+            <w:color w:val="1F4E99"/>
+          </w:rPr>
+          <w:t xml:space="preserve">https://iowalionseyebank.org/news/2025/02/iowa-lions-eye-bank-shares-expertise-corneal-specialists-india</w:t>
+        </w:r>
+      </w:hyperlink>
+    </w:p>
+    <w:p>
+      <w:pPr>
+        <w:tabs>
+          <w:tab w:pos="567" w:val="left"/>
+        </w:tabs>
+        <w:spacing w:after="120"/>
+        <w:ind w:left="567" w:hanging="567"/>
+      </w:pPr>
+      <w:r>
+        <w:rPr>
+          <w:b/>
+          <w:color w:val="B31822"/>
+        </w:rPr>
+        <w:t>129.</w:t>
+        <w:tab/>
+      </w:r>
+      <w:r>
+        <w:t xml:space="preserve">Tanya Verma. “AIIMS Jammu and University of Michigan Collaborate for Twin International Conferences.” CollegeHai, 2025-11-14. </w:t>
+      </w:r>
+      <w:hyperlink r:id="rId138">
+        <w:r>
+          <w:rPr>
+            <w:color w:val="1F4E99"/>
+          </w:rPr>
+          <w:t xml:space="preserve">https://collegehai.com/news/aiims-jammu-university-of-michigan-international-conferences</w:t>
+        </w:r>
+      </w:hyperlink>
+    </w:p>
+    <w:p>
+      <w:pPr>
+        <w:tabs>
+          <w:tab w:pos="567" w:val="left"/>
+        </w:tabs>
+        <w:spacing w:after="120"/>
+        <w:ind w:left="567" w:hanging="567"/>
+      </w:pPr>
+      <w:r>
+        <w:rPr>
+          <w:b/>
+          <w:color w:val="B31822"/>
+        </w:rPr>
+        <w:t>130.</w:t>
+        <w:tab/>
+      </w:r>
+      <w:r>
+        <w:t xml:space="preserve">UW Department of Ophthalmology and Visual Sciences. “DOVS Celebrates a Decade of Partnership with Colleagues in India.” UW-Madison Ophthalmology, 2025-02-28. </w:t>
+      </w:r>
+      <w:hyperlink r:id="rId139">
+        <w:r>
+          <w:rPr>
+            <w:color w:val="1F4E99"/>
+          </w:rPr>
+          <w:t xml:space="preserve">https://www.ophth.wisc.edu/blog/2025/02/28/india_rotation_2025</w:t>
+        </w:r>
+      </w:hyperlink>
+    </w:p>
+    <w:p>
+      <w:pPr>
+        <w:tabs>
+          <w:tab w:pos="567" w:val="left"/>
+        </w:tabs>
+        <w:spacing w:after="120"/>
+        <w:ind w:left="567" w:hanging="567"/>
+      </w:pPr>
+      <w:r>
+        <w:rPr>
+          <w:b/>
+          <w:color w:val="B31822"/>
+        </w:rPr>
+        <w:t>131.</w:t>
+        <w:tab/>
+      </w:r>
+      <w:r>
+        <w:t xml:space="preserve">Telangana Today. “Apollo Hospitals launches International second opinion services for patients.” Telangana Today, January 2022. </w:t>
+      </w:r>
+      <w:hyperlink r:id="rId140">
+        <w:r>
+          <w:rPr>
+            <w:color w:val="1F4E99"/>
+          </w:rPr>
+          <w:t xml:space="preserve">https://telanganatoday.com/apollo-hospitals-launches-international-second-opinion-services-for-patients</w:t>
+        </w:r>
+      </w:hyperlink>
+    </w:p>
+    <w:p>
+      <w:pPr>
+        <w:tabs>
+          <w:tab w:pos="567" w:val="left"/>
+        </w:tabs>
+        <w:spacing w:after="120"/>
+        <w:ind w:left="567" w:hanging="567"/>
+      </w:pPr>
+      <w:r>
+        <w:rPr>
+          <w:b/>
+          <w:color w:val="B31822"/>
+        </w:rPr>
+        <w:t>132.</w:t>
+        <w:tab/>
+      </w:r>
+      <w:r>
+        <w:t xml:space="preserve">Johns Hopkins School of Nursing and CMC Vellore College of Nursing authors. “Leveraging a Global Partnership to Address COVID-19-Related Mental Health Challenges.” Journal of Psychiatric and Mental Health Nursing (PubMed 39361448), 3 October 2024. </w:t>
+      </w:r>
+      <w:hyperlink r:id="rId141">
+        <w:r>
+          <w:rPr>
+            <w:color w:val="1F4E99"/>
+          </w:rPr>
+          <w:t xml:space="preserve">https://onlinelibrary.wiley.com/doi/10.1111/jpm.13115</w:t>
+        </w:r>
+      </w:hyperlink>
+    </w:p>
+    <w:p>
+      <w:pPr>
+        <w:tabs>
+          <w:tab w:pos="567" w:val="left"/>
+        </w:tabs>
+        <w:spacing w:after="120"/>
+        <w:ind w:left="567" w:hanging="567"/>
+      </w:pPr>
+      <w:r>
+        <w:rPr>
+          <w:b/>
+          <w:color w:val="B31822"/>
+        </w:rPr>
+        <w:t>133.</w:t>
+        <w:tab/>
+      </w:r>
+      <w:r>
+        <w:t xml:space="preserve">Post Bulletin. “Billionaire to partner with Mayo Clinic on India hospitals.” Post Bulletin, 11 February 2025. </w:t>
+      </w:r>
+      <w:hyperlink r:id="rId142">
         <w:r>
           <w:rPr>
             <w:color w:val="1F4E99"/>
@@ -3105,18 +3777,18 @@
           <w:b/>
           <w:color w:val="B31822"/>
         </w:rPr>
-        <w:t>110.</w:t>
+        <w:t>134.</w:t>
         <w:tab/>
       </w:r>
       <w:r>
-        <w:t xml:space="preserve">Press Trust of India. “Lilavati Hospital, Mayo Clinic to establish 300-bed cancer institute in Mumbai.” Medical Buyer, 24 January 2025. </w:t>
-      </w:r>
-      <w:hyperlink r:id="rId119">
+        <w:t xml:space="preserve">Memorial Sloan Kettering Cancer Center. “Memorial Sloan Kettering Cancer Center Launches MSKCC India to Expand Access to World-Renowned Oncologists, Cancer Care, Research, and Education.” PR Newswire, 2 August 2021. </w:t>
+      </w:r>
+      <w:hyperlink r:id="rId143">
         <w:r>
           <w:rPr>
             <w:color w:val="1F4E99"/>
           </w:rPr>
-          <w:t xml:space="preserve">https://medicalbuyer.co.in/lilavati-hospital-mayo-clinic-to-establish-300-bed-cancer-institute-in-mumbai/</w:t>
+          <w:t xml:space="preserve">https://www.prnewswire.com/news-releases/memorial-sloan-kettering-cancer-center-launches-mskcc-india-to-expand-access-to-world-renowned-oncologists-cancer-care-research-and-education-301345795.html</w:t>
         </w:r>
       </w:hyperlink>
     </w:p>
@@ -3133,18 +3805,18 @@
           <w:b/>
           <w:color w:val="B31822"/>
         </w:rPr>
-        <w:t>111.</w:t>
+        <w:t>135.</w:t>
         <w:tab/>
       </w:r>
       <w:r>
-        <w:t xml:space="preserve">Kajal Rajput. “Mayo Clinic, Lilavati Hospital complete India's first Nursing Excellence Training Program.” Medical Dialogues, 29 March 2025. </w:t>
-      </w:r>
-      <w:hyperlink r:id="rId120">
+        <w:t xml:space="preserve">Northwell Health. “Northwell Health signs five-year strategic agreement with Indian health system, CMC Vellore.” Northwell Health, 2023-03. </w:t>
+      </w:r>
+      <w:hyperlink r:id="rId144">
         <w:r>
           <w:rPr>
             <w:color w:val="1F4E99"/>
           </w:rPr>
-          <w:t xml:space="preserve">https://medicaldialogues.in/news/health/hospital-diagnostics/mayo-clinic-lilavati-hospital-complete-indias-first-nursing-excellence-training-program-145698</w:t>
+          <w:t xml:space="preserve">https://www.northwell.edu/news/the-latest/northwell-signs-5-year-strategic-agreement-india-s-cmc-vellore</w:t>
         </w:r>
       </w:hyperlink>
     </w:p>
@@ -3161,18 +3833,18 @@
           <w:b/>
           <w:color w:val="B31822"/>
         </w:rPr>
-        <w:t>112.</w:t>
+        <w:t>136.</w:t>
         <w:tab/>
       </w:r>
       <w:r>
-        <w:t xml:space="preserve">Mayo Clinic. “Mayo Clinic opens patient information office in India.” Newswise, 6 February 2023. </w:t>
-      </w:r>
-      <w:hyperlink r:id="rId121">
+        <w:t xml:space="preserve">Domain-b. “HCL enters healthcare with HCL Avitas.” Domain-b, 6 February 2014. </w:t>
+      </w:r>
+      <w:hyperlink r:id="rId145">
         <w:r>
           <w:rPr>
             <w:color w:val="1F4E99"/>
           </w:rPr>
-          <w:t xml:space="preserve">https://www.newswise.com/articles/mayo-clinic-opens-patient-information-office-in-india</w:t>
+          <w:t xml:space="preserve">https://www.domain-b.com/companies-organisations/firms-companies/hcl-enters-healthcare-with-hcl-avitas</w:t>
         </w:r>
       </w:hyperlink>
     </w:p>
@@ -3189,13 +3861,349 @@
           <w:b/>
           <w:color w:val="B31822"/>
         </w:rPr>
-        <w:t>113.</w:t>
+        <w:t>137.</w:t>
         <w:tab/>
       </w:r>
       <w:r>
+        <w:t xml:space="preserve">The University of Texas MD Anderson Cancer Center. “Project ECHO: Palliative Care Africa (PACA) II.” MD Anderson Cancer Center, undated. </w:t>
+      </w:r>
+      <w:hyperlink r:id="rId146">
+        <w:r>
+          <w:rPr>
+            <w:color w:val="1F4E99"/>
+          </w:rPr>
+          <w:t xml:space="preserve">https://www.mdanderson.org/education-training/outreach-programs/project-echo/programs/palliative-care-africa.html</w:t>
+        </w:r>
+      </w:hyperlink>
+    </w:p>
+    <w:p>
+      <w:pPr>
+        <w:tabs>
+          <w:tab w:pos="567" w:val="left"/>
+        </w:tabs>
+        <w:spacing w:after="120"/>
+        <w:ind w:left="567" w:hanging="567"/>
+      </w:pPr>
+      <w:r>
+        <w:rPr>
+          <w:b/>
+          <w:color w:val="B31822"/>
+        </w:rPr>
+        <w:t>138.</w:t>
+        <w:tab/>
+      </w:r>
+      <w:r>
+        <w:t xml:space="preserve">Cambridge University Hospitals. “Health team prepare for India mission.” Cambridge University Hospitals NHS Foundation Trust, 6 August 2025. </w:t>
+      </w:r>
+      <w:hyperlink r:id="rId147">
+        <w:r>
+          <w:rPr>
+            <w:color w:val="1F4E99"/>
+          </w:rPr>
+          <w:t xml:space="preserve">https://www.cuh.nhs.uk/news/health-team-prepare-for-india-mission/</w:t>
+        </w:r>
+      </w:hyperlink>
+    </w:p>
+    <w:p>
+      <w:pPr>
+        <w:tabs>
+          <w:tab w:pos="567" w:val="left"/>
+        </w:tabs>
+        <w:spacing w:after="120"/>
+        <w:ind w:left="567" w:hanging="567"/>
+      </w:pPr>
+      <w:r>
+        <w:rPr>
+          <w:b/>
+          <w:color w:val="B31822"/>
+        </w:rPr>
+        <w:t>139.</w:t>
+        <w:tab/>
+      </w:r>
+      <w:r>
+        <w:t xml:space="preserve">PTI. “SHEOWS and Juntendo University, Tokyo Sign MoU to Advance Geriatric Care and Research Collaboration Between India and Japan.” The Wire (PTI), 2026-08-10. </w:t>
+      </w:r>
+      <w:hyperlink r:id="rId148">
+        <w:r>
+          <w:rPr>
+            <w:color w:val="1F4E99"/>
+          </w:rPr>
+          <w:t xml:space="preserve">https://m.thewire.in/article/ptiprnews/sheows-and-juntendo-university-tokyo-sign-mou-to-advance-geriatric-care-and-research-collaboration-between-india-and-japan/amp</w:t>
+        </w:r>
+      </w:hyperlink>
+    </w:p>
+    <w:p>
+      <w:pPr>
+        <w:tabs>
+          <w:tab w:pos="567" w:val="left"/>
+        </w:tabs>
+        <w:spacing w:after="120"/>
+        <w:ind w:left="567" w:hanging="567"/>
+      </w:pPr>
+      <w:r>
+        <w:rPr>
+          <w:b/>
+          <w:color w:val="B31822"/>
+        </w:rPr>
+        <w:t>140.</w:t>
+        <w:tab/>
+      </w:r>
+      <w:r>
+        <w:t xml:space="preserve">Amit Srivastava. “Hinduja Foundation Offers MSc And PhD Scholarships For Indian Students At King's College London For 2026-27.” Free Press Journal, 2026-05-22. </w:t>
+      </w:r>
+      <w:hyperlink r:id="rId149">
+        <w:r>
+          <w:rPr>
+            <w:color w:val="1F4E99"/>
+          </w:rPr>
+          <w:t xml:space="preserve">https://www.freepressjournal.in/education/hinduja-foundation-offers-msc-and-phd-scholarships-for-indian-students-at-kings-college-london-for-202627</w:t>
+        </w:r>
+      </w:hyperlink>
+    </w:p>
+    <w:p>
+      <w:pPr>
+        <w:tabs>
+          <w:tab w:pos="567" w:val="left"/>
+        </w:tabs>
+        <w:spacing w:after="120"/>
+        <w:ind w:left="567" w:hanging="567"/>
+      </w:pPr>
+      <w:r>
+        <w:rPr>
+          <w:b/>
+          <w:color w:val="B31822"/>
+        </w:rPr>
+        <w:t>141.</w:t>
+        <w:tab/>
+      </w:r>
+      <w:r>
+        <w:t xml:space="preserve">Health News. “Monash University Partners with Apollo Hospitals for Digital Health Research.” Digital Health News, 2024-11-29. </w:t>
+      </w:r>
+      <w:hyperlink r:id="rId150">
+        <w:r>
+          <w:rPr>
+            <w:color w:val="1F4E99"/>
+          </w:rPr>
+          <w:t xml:space="preserve">https://www.digitalhealthnews.com/monash-university-partners-with-apollo-hospitals-for-digital-health-research</w:t>
+        </w:r>
+      </w:hyperlink>
+    </w:p>
+    <w:p>
+      <w:pPr>
+        <w:tabs>
+          <w:tab w:pos="567" w:val="left"/>
+        </w:tabs>
+        <w:spacing w:after="120"/>
+        <w:ind w:left="567" w:hanging="567"/>
+      </w:pPr>
+      <w:r>
+        <w:rPr>
+          <w:b/>
+          <w:color w:val="B31822"/>
+        </w:rPr>
+        <w:t>142.</w:t>
+        <w:tab/>
+      </w:r>
+      <w:r>
+        <w:t xml:space="preserve">Team VOH. “Athulya Senior Care Inks Landmark MoU with SingHealth to Advance Senior Care, Training, and Research Collaboration.” VOH Network, 2026-04-29. </w:t>
+      </w:r>
+      <w:hyperlink r:id="rId151">
+        <w:r>
+          <w:rPr>
+            <w:color w:val="1F4E99"/>
+          </w:rPr>
+          <w:t xml:space="preserve">https://vohnetwork.com/news/hospitals-providers/athulya-senior-care-inks-landmark-mou-with-singhealth-to-advance-senior-care-training-and-research-collaboration</w:t>
+        </w:r>
+      </w:hyperlink>
+    </w:p>
+    <w:p>
+      <w:pPr>
+        <w:tabs>
+          <w:tab w:pos="567" w:val="left"/>
+        </w:tabs>
+        <w:spacing w:after="120"/>
+        <w:ind w:left="567" w:hanging="567"/>
+      </w:pPr>
+      <w:r>
+        <w:rPr>
+          <w:b/>
+          <w:color w:val="B31822"/>
+        </w:rPr>
+        <w:t>143.</w:t>
+        <w:tab/>
+      </w:r>
+      <w:r>
+        <w:t xml:space="preserve">University College London. “Inaugural recipients of UCL-AIIMS-IITD trilateral seed funds revealed.” University College London, November 2025. </w:t>
+      </w:r>
+      <w:hyperlink r:id="rId152">
+        <w:r>
+          <w:rPr>
+            <w:color w:val="1F4E99"/>
+          </w:rPr>
+          <w:t xml:space="preserve">https://www.ucl.ac.uk/global/news/2025/nov/inaugural-recipients-ucl-aiims-iitd-trilateral-seed-funds-revealed</w:t>
+        </w:r>
+      </w:hyperlink>
+    </w:p>
+    <w:p>
+      <w:pPr>
+        <w:tabs>
+          <w:tab w:pos="567" w:val="left"/>
+        </w:tabs>
+        <w:spacing w:after="120"/>
+        <w:ind w:left="567" w:hanging="567"/>
+      </w:pPr>
+      <w:r>
+        <w:rPr>
+          <w:b/>
+          <w:color w:val="B31822"/>
+        </w:rPr>
+        <w:t>144.</w:t>
+        <w:tab/>
+      </w:r>
+      <w:r>
+        <w:t xml:space="preserve">IPP Bureau. “University of Leicester, Apollo showcase AI-driven healthcare research to strengthen UK-India collaboration.” Indian Pharma Post, 2026-07-16. </w:t>
+      </w:r>
+      <w:hyperlink r:id="rId153">
+        <w:r>
+          <w:rPr>
+            <w:color w:val="1F4E99"/>
+          </w:rPr>
+          <w:t xml:space="preserve">https://www.indianpharmapost.com/hospitals/university-of-leicester-apollo-showcase-ai-driven-healthcare-research-to-strengthen-uk-india-collaboration-20937</w:t>
+        </w:r>
+      </w:hyperlink>
+    </w:p>
+    <w:p>
+      <w:pPr>
+        <w:tabs>
+          <w:tab w:pos="567" w:val="left"/>
+        </w:tabs>
+        <w:spacing w:after="120"/>
+        <w:ind w:left="567" w:hanging="567"/>
+      </w:pPr>
+      <w:r>
+        <w:rPr>
+          <w:b/>
+          <w:color w:val="B31822"/>
+        </w:rPr>
+        <w:t>145.</w:t>
+        <w:tab/>
+      </w:r>
+      <w:r>
+        <w:t xml:space="preserve">University of Liverpool. “New partnerships build on Liverpool-India research and education ties.” University of Liverpool, 2025-07-14. </w:t>
+      </w:r>
+      <w:hyperlink r:id="rId154">
+        <w:r>
+          <w:rPr>
+            <w:color w:val="1F4E99"/>
+          </w:rPr>
+          <w:t xml:space="preserve">https://news.liverpool.ac.uk/2025/07/14/new-partnerships-further-strengthen-liverpool-india-research-and-education-ties/</w:t>
+        </w:r>
+      </w:hyperlink>
+    </w:p>
+    <w:p>
+      <w:pPr>
+        <w:tabs>
+          <w:tab w:pos="567" w:val="left"/>
+        </w:tabs>
+        <w:spacing w:after="120"/>
+        <w:ind w:left="567" w:hanging="567"/>
+      </w:pPr>
+      <w:r>
+        <w:rPr>
+          <w:b/>
+          <w:color w:val="B31822"/>
+        </w:rPr>
+        <w:t>146.</w:t>
+        <w:tab/>
+      </w:r>
+      <w:r>
+        <w:t xml:space="preserve">Press Trust of India. “AIIMS Delhi, Munich-based university sign agreement for research in medicine, life sciences.” Careers360, 2023-09-16. </w:t>
+      </w:r>
+      <w:hyperlink r:id="rId155">
+        <w:r>
+          <w:rPr>
+            <w:color w:val="1F4E99"/>
+          </w:rPr>
+          <w:t xml:space="preserve">https://news.careers360.com/aiims-delhi-munich-based-university-sign-non-binding-mou-for-collaborative-endeavours/amp</w:t>
+        </w:r>
+      </w:hyperlink>
+    </w:p>
+    <w:p>
+      <w:pPr>
+        <w:tabs>
+          <w:tab w:pos="567" w:val="left"/>
+        </w:tabs>
+        <w:spacing w:after="120"/>
+        <w:ind w:left="567" w:hanging="567"/>
+      </w:pPr>
+      <w:r>
+        <w:rPr>
+          <w:b/>
+          <w:color w:val="B31822"/>
+        </w:rPr>
+        <w:t>147.</w:t>
+        <w:tab/>
+      </w:r>
+      <w:r>
+        <w:t xml:space="preserve">News Services Division. “AIIMS New Delhi signed MoU with University of Bolton Institute of Medicine.” All India Radio News, 2024-05-15. </w:t>
+      </w:r>
+      <w:hyperlink r:id="rId156">
+        <w:r>
+          <w:rPr>
+            <w:color w:val="1F4E99"/>
+          </w:rPr>
+          <w:t xml:space="preserve">https://newsonair.gov.in/aiims-new-delhi-signed-mou-with-university-of-bolton-institute-of-medicine</w:t>
+        </w:r>
+      </w:hyperlink>
+    </w:p>
+    <w:p>
+      <w:pPr>
+        <w:tabs>
+          <w:tab w:pos="567" w:val="left"/>
+        </w:tabs>
+        <w:spacing w:after="120"/>
+        <w:ind w:left="567" w:hanging="567"/>
+      </w:pPr>
+      <w:r>
+        <w:rPr>
+          <w:b/>
+          <w:color w:val="B31822"/>
+        </w:rPr>
+        <w:t>148.</w:t>
+        <w:tab/>
+      </w:r>
+      <w:r>
+        <w:t xml:space="preserve">DD News. “West Bengal joins Ayushman Bharat PM-JAY, completing nationwide rollout of world's largest health assurance scheme.” 8 June 2026. </w:t>
+      </w:r>
+      <w:hyperlink r:id="rId157">
+        <w:r>
+          <w:rPr>
+            <w:color w:val="1F4E99"/>
+          </w:rPr>
+          <w:t xml:space="preserve">https://ddnews.gov.in/en/west-bengal-joins-ayushman-bharat-pm-jay-completing-nationwide-rollout-of-worlds-largest-health-assurance-scheme/</w:t>
+        </w:r>
+      </w:hyperlink>
+    </w:p>
+    <w:p>
+      <w:pPr>
+        <w:tabs>
+          <w:tab w:pos="567" w:val="left"/>
+        </w:tabs>
+        <w:spacing w:after="120"/>
+        <w:ind w:left="567" w:hanging="567"/>
+      </w:pPr>
+      <w:r>
+        <w:rPr>
+          <w:b/>
+          <w:color w:val="B31822"/>
+        </w:rPr>
+        <w:t>149.</w:t>
+        <w:tab/>
+      </w:r>
+      <w:r>
         <w:t xml:space="preserve">Anurag Roushan. “Maharashtra's mega 'MediCity' takes off: Cleveland Clinic joins Rs 10,000 crore healthcare hub.” India TV News, 11 June 2026. </w:t>
       </w:r>
-      <w:hyperlink r:id="rId122">
+      <w:hyperlink r:id="rId158">
         <w:r>
           <w:rPr>
             <w:color w:val="1F4E99"/>
@@ -3217,18 +4225,18 @@
           <w:b/>
           <w:color w:val="B31822"/>
         </w:rPr>
-        <w:t>114.</w:t>
+        <w:t>150.</w:t>
         <w:tab/>
       </w:r>
       <w:r>
-        <w:t xml:space="preserve">Cleveland Clinic. “India Resources: A Top Hospital In The US.” </w:t>
-      </w:r>
-      <w:hyperlink r:id="rId123">
+        <w:t xml:space="preserve">Deccan Herald. “Maharashtra signs MoU with Cleveland Clinic-led consortium for $1.2 billion Navi Mumbai MediCity.” 10 June 2026. </w:t>
+      </w:r>
+      <w:hyperlink r:id="rId159">
         <w:r>
           <w:rPr>
             <w:color w:val="1F4E99"/>
           </w:rPr>
-          <w:t xml:space="preserve">https://my.clevelandclinic.org/patients/international/locations/india</w:t>
+          <w:t xml:space="preserve">https://www.deccanherald.com/india/maharashtra/maharashtra-signs-mou-with-cleveland-clinic-led-consortium-for-12-billion-navi-mumbai-medicity-4034760</w:t>
         </w:r>
       </w:hyperlink>
     </w:p>
@@ -3245,18 +4253,18 @@
           <w:b/>
           <w:color w:val="B31822"/>
         </w:rPr>
-        <w:t>115.</w:t>
+        <w:t>151.</w:t>
         <w:tab/>
       </w:r>
       <w:r>
-        <w:t xml:space="preserve">Johns Hopkins Medicine International. “HCL Healthcare.” </w:t>
-      </w:r>
-      <w:hyperlink r:id="rId124">
+        <w:t xml:space="preserve">BusinessToday. “Manipal Health Enterprises makes solid stock market debut; shares list at 11% premium.” 5 August 2026. </w:t>
+      </w:r>
+      <w:hyperlink r:id="rId160">
         <w:r>
           <w:rPr>
             <w:color w:val="1F4E99"/>
           </w:rPr>
-          <w:t xml:space="preserve">https://www.hopkinsmedicine.org/international/health-care-consulting/asia-pacific/hcl-healthcare</w:t>
+          <w:t xml:space="preserve">https://www.businesstoday.in/markets/stocks/story/manipal-health-enterprises-makes-solid-stock-market-debut-shares-list-at-11-premium-547257-2026-08-05</w:t>
         </w:r>
       </w:hyperlink>
     </w:p>
@@ -3273,601 +4281,13 @@
           <w:b/>
           <w:color w:val="B31822"/>
         </w:rPr>
-        <w:t>116.</w:t>
+        <w:t>152.</w:t>
         <w:tab/>
       </w:r>
       <w:r>
-        <w:t xml:space="preserve">Domain-b. “HCL enters healthcare with HCL Avitas.” 6 February 2014. </w:t>
-      </w:r>
-      <w:hyperlink r:id="rId125">
-        <w:r>
-          <w:rPr>
-            <w:color w:val="1F4E99"/>
-          </w:rPr>
-          <w:t xml:space="preserve">https://www.domain-b.com/companies-organisations/firms-companies/hcl-enters-healthcare-with-hcl-avitas</w:t>
-        </w:r>
-      </w:hyperlink>
-    </w:p>
-    <w:p>
-      <w:pPr>
-        <w:tabs>
-          <w:tab w:pos="567" w:val="left"/>
-        </w:tabs>
-        <w:spacing w:after="120"/>
-        <w:ind w:left="567" w:hanging="567"/>
-      </w:pPr>
-      <w:r>
-        <w:rPr>
-          <w:b/>
-          <w:color w:val="B31822"/>
-        </w:rPr>
-        <w:t>117.</w:t>
-        <w:tab/>
-      </w:r>
-      <w:r>
-        <w:t xml:space="preserve">Gupta-Klinsky India Institute, Johns Hopkins University. “Collaboration Agreement with IIT Bombay and Roundtable Discussion Shine a Spotlight on Digital Health.” </w:t>
-      </w:r>
-      <w:hyperlink r:id="rId126">
-        <w:r>
-          <w:rPr>
-            <w:color w:val="1F4E99"/>
-          </w:rPr>
-          <w:t xml:space="preserve">https://indiainstitute.jhu.edu/news/news-2025/news-from-gkii/collaboration-agreement-with-iit-bombay-and-roundtable-discussion-shine-a-spotlight-on-digital-health</w:t>
-        </w:r>
-      </w:hyperlink>
-    </w:p>
-    <w:p>
-      <w:pPr>
-        <w:tabs>
-          <w:tab w:pos="567" w:val="left"/>
-        </w:tabs>
-        <w:spacing w:after="120"/>
-        <w:ind w:left="567" w:hanging="567"/>
-      </w:pPr>
-      <w:r>
-        <w:rPr>
-          <w:b/>
-          <w:color w:val="B31822"/>
-        </w:rPr>
-        <w:t>118.</w:t>
-        <w:tab/>
-      </w:r>
-      <w:r>
-        <w:t xml:space="preserve">Memorial Sloan Kettering Cancer Center. “Memorial Sloan Kettering Cancer Center Launches MSKCC India to Expand Access to World-Renowned Oncologists, Cancer Care, Research, and Education.” PR Newswire, 2 August 2021. </w:t>
-      </w:r>
-      <w:hyperlink r:id="rId127">
-        <w:r>
-          <w:rPr>
-            <w:color w:val="1F4E99"/>
-          </w:rPr>
-          <w:t xml:space="preserve">https://www.prnewswire.com/news-releases/memorial-sloan-kettering-cancer-center-launches-mskcc-india-to-expand-access-to-world-renowned-oncologists-cancer-care-research-and-education-301345795.html</w:t>
-        </w:r>
-      </w:hyperlink>
-    </w:p>
-    <w:p>
-      <w:pPr>
-        <w:tabs>
-          <w:tab w:pos="567" w:val="left"/>
-        </w:tabs>
-        <w:spacing w:after="120"/>
-        <w:ind w:left="567" w:hanging="567"/>
-      </w:pPr>
-      <w:r>
-        <w:rPr>
-          <w:b/>
-          <w:color w:val="B31822"/>
-        </w:rPr>
-        <w:t>119.</w:t>
-        <w:tab/>
-      </w:r>
-      <w:r>
-        <w:t xml:space="preserve">iCliniq. “Frequently Asked Question: MSK India.” </w:t>
-      </w:r>
-      <w:hyperlink r:id="rId128">
-        <w:r>
-          <w:rPr>
-            <w:color w:val="1F4E99"/>
-          </w:rPr>
-          <w:t xml:space="preserve">https://mskcc.icliniq.com/mskcc-india-services/mskcc-patient-faqs</w:t>
-        </w:r>
-      </w:hyperlink>
-    </w:p>
-    <w:p>
-      <w:pPr>
-        <w:tabs>
-          <w:tab w:pos="567" w:val="left"/>
-        </w:tabs>
-        <w:spacing w:after="120"/>
-        <w:ind w:left="567" w:hanging="567"/>
-      </w:pPr>
-      <w:r>
-        <w:rPr>
-          <w:b/>
-          <w:color w:val="B31822"/>
-        </w:rPr>
-        <w:t>120.</w:t>
-        <w:tab/>
-      </w:r>
-      <w:r>
-        <w:t xml:space="preserve">India Herald. “MD Anderson Cancer Center signs sister institution accord with Tata Memorial.” 17 October 2003. </w:t>
-      </w:r>
-      <w:hyperlink r:id="rId129">
-        <w:r>
-          <w:rPr>
-            <w:color w:val="1F4E99"/>
-          </w:rPr>
-          <w:t xml:space="preserve">https://india-herald.com/md-anderson-cancer-center-signs-sister-institution-accord-with-tata-memoria-p305-19.htm</w:t>
-        </w:r>
-      </w:hyperlink>
-    </w:p>
-    <w:p>
-      <w:pPr>
-        <w:tabs>
-          <w:tab w:pos="567" w:val="left"/>
-        </w:tabs>
-        <w:spacing w:after="120"/>
-        <w:ind w:left="567" w:hanging="567"/>
-      </w:pPr>
-      <w:r>
-        <w:rPr>
-          <w:b/>
-          <w:color w:val="B31822"/>
-        </w:rPr>
-        <w:t>121.</w:t>
-        <w:tab/>
-      </w:r>
-      <w:r>
-        <w:t xml:space="preserve">The University of Texas MD Anderson Cancer Center. “Project ECHO: Palliative Care Africa (PACA) II.” </w:t>
-      </w:r>
-      <w:hyperlink r:id="rId130">
-        <w:r>
-          <w:rPr>
-            <w:color w:val="1F4E99"/>
-          </w:rPr>
-          <w:t xml:space="preserve">https://www.mdanderson.org/education-training/outreach-programs/project-echo/programs/palliative-care-africa.html</w:t>
-        </w:r>
-      </w:hyperlink>
-    </w:p>
-    <w:p>
-      <w:pPr>
-        <w:tabs>
-          <w:tab w:pos="567" w:val="left"/>
-        </w:tabs>
-        <w:spacing w:after="120"/>
-        <w:ind w:left="567" w:hanging="567"/>
-      </w:pPr>
-      <w:r>
-        <w:rPr>
-          <w:b/>
-          <w:color w:val="B31822"/>
-        </w:rPr>
-        <w:t>122.</w:t>
-        <w:tab/>
-      </w:r>
-      <w:r>
-        <w:t xml:space="preserve">Mount Sinai Health System. “Ramaiah Memorial Hospital Signs Long Term Collaboration Agreement with the Mount Sinai Health System in New York for Specialty Care Development and Quality and Technological Advancements.” GlobeNewswire via Yahoo Finance, 12 July 2024. </w:t>
-      </w:r>
-      <w:hyperlink r:id="rId131">
-        <w:r>
-          <w:rPr>
-            <w:color w:val="1F4E99"/>
-          </w:rPr>
-          <w:t xml:space="preserve">https://finance.yahoo.com/news/ramaiah-memorial-hospital-signs-long-143000744.html</w:t>
-        </w:r>
-      </w:hyperlink>
-    </w:p>
-    <w:p>
-      <w:pPr>
-        <w:tabs>
-          <w:tab w:pos="567" w:val="left"/>
-        </w:tabs>
-        <w:spacing w:after="120"/>
-        <w:ind w:left="567" w:hanging="567"/>
-      </w:pPr>
-      <w:r>
-        <w:rPr>
-          <w:b/>
-          <w:color w:val="B31822"/>
-        </w:rPr>
-        <w:t>123.</w:t>
-        <w:tab/>
-      </w:r>
-      <w:r>
-        <w:t xml:space="preserve">Mount Sinai Health System. “Ramaiah Memorial Hospital Signs Long Term Collaboration Agreement with the Mount Sinai Health System in New York for Specialty Care Development and Quality and Technological Advancements.” 2024. </w:t>
-      </w:r>
-      <w:hyperlink r:id="rId132">
-        <w:r>
-          <w:rPr>
-            <w:color w:val="1F4E99"/>
-          </w:rPr>
-          <w:t xml:space="preserve">https://www.mountsinai.org/about/newsroom/2024/ramaiah-memorial-hospital-signs-long-term-collaboration-agreement-with-the-mount-sinai-health-system-in-new-york-for-specialty-care-development-and-quality-and-technological-advancements</w:t>
-        </w:r>
-      </w:hyperlink>
-    </w:p>
-    <w:p>
-      <w:pPr>
-        <w:tabs>
-          <w:tab w:pos="567" w:val="left"/>
-        </w:tabs>
-        <w:spacing w:after="120"/>
-        <w:ind w:left="567" w:hanging="567"/>
-      </w:pPr>
-      <w:r>
-        <w:rPr>
-          <w:b/>
-          <w:color w:val="B31822"/>
-        </w:rPr>
-        <w:t>124.</w:t>
-        <w:tab/>
-      </w:r>
-      <w:r>
-        <w:t xml:space="preserve">Deccan Herald. “Ramaiah Memorial inks 10-year partnership with Mount Sinai Health System of New York.” 13 July 2024. </w:t>
-      </w:r>
-      <w:hyperlink r:id="rId133">
-        <w:r>
-          <w:rPr>
-            <w:color w:val="1F4E99"/>
-          </w:rPr>
-          <w:t xml:space="preserve">https://www.deccanherald.com/india/karnataka/bengaluru/ramaiah-memorial-inks-10-year-partnership-with-mount-sinai-health-system-of-new-york-3103995</w:t>
-        </w:r>
-      </w:hyperlink>
-    </w:p>
-    <w:p>
-      <w:pPr>
-        <w:tabs>
-          <w:tab w:pos="567" w:val="left"/>
-        </w:tabs>
-        <w:spacing w:after="120"/>
-        <w:ind w:left="567" w:hanging="567"/>
-      </w:pPr>
-      <w:r>
-        <w:rPr>
-          <w:b/>
-          <w:color w:val="B31822"/>
-        </w:rPr>
-        <w:t>125.</w:t>
-        <w:tab/>
-      </w:r>
-      <w:r>
-        <w:t xml:space="preserve">M S Ramaiah Memorial Hospital. “MS Ramaiah Hospital, Bangalore and Mount Sinai Hospital, New York Teams Up.” </w:t>
-      </w:r>
-      <w:hyperlink r:id="rId134">
-        <w:r>
-          <w:rPr>
-            <w:color w:val="1F4E99"/>
-          </w:rPr>
-          <w:t xml:space="preserve">https://msrmh.com/collaborations/</w:t>
-        </w:r>
-      </w:hyperlink>
-    </w:p>
-    <w:p>
-      <w:pPr>
-        <w:tabs>
-          <w:tab w:pos="567" w:val="left"/>
-        </w:tabs>
-        <w:spacing w:after="120"/>
-        <w:ind w:left="567" w:hanging="567"/>
-      </w:pPr>
-      <w:r>
-        <w:rPr>
-          <w:b/>
-          <w:color w:val="B31822"/>
-        </w:rPr>
-        <w:t>126.</w:t>
-        <w:tab/>
-      </w:r>
-      <w:r>
-        <w:t xml:space="preserve">UCLA Health, Department of Obstetrics and Gynecology. “UCLA-India Global Health Exchange in OB/GYN.” </w:t>
-      </w:r>
-      <w:hyperlink r:id="rId135">
-        <w:r>
-          <w:rPr>
-            <w:color w:val="1F4E99"/>
-          </w:rPr>
-          <w:t xml:space="preserve">https://www.uclahealth.org/departments/obgyn/about-us/global-reproductive-health-alliance-collaborative-engagement/ucla-india-global-health-exchange-obgyn</w:t>
-        </w:r>
-      </w:hyperlink>
-    </w:p>
-    <w:p>
-      <w:pPr>
-        <w:tabs>
-          <w:tab w:pos="567" w:val="left"/>
-        </w:tabs>
-        <w:spacing w:after="120"/>
-        <w:ind w:left="567" w:hanging="567"/>
-      </w:pPr>
-      <w:r>
-        <w:rPr>
-          <w:b/>
-          <w:color w:val="B31822"/>
-        </w:rPr>
-        <w:t>127.</w:t>
-        <w:tab/>
-      </w:r>
-      <w:r>
-        <w:t xml:space="preserve">NewYork-Presbyterian. “Disaster Experts from NewYork-Presbyterian Go to India and Sri Lanka to Improve Emergency Preparedness and Response.” 6 November 2008. </w:t>
-      </w:r>
-      <w:hyperlink r:id="rId136">
-        <w:r>
-          <w:rPr>
-            <w:color w:val="1F4E99"/>
-          </w:rPr>
-          <w:t xml:space="preserve">https://www.nyp.org/news/nyp-disaster-experts-go-to-india-and-sri-lanka-improve-emergency</w:t>
-        </w:r>
-      </w:hyperlink>
-    </w:p>
-    <w:p>
-      <w:pPr>
-        <w:tabs>
-          <w:tab w:pos="567" w:val="left"/>
-        </w:tabs>
-        <w:spacing w:after="120"/>
-        <w:ind w:left="567" w:hanging="567"/>
-      </w:pPr>
-      <w:r>
-        <w:rPr>
-          <w:b/>
-          <w:color w:val="B31822"/>
-        </w:rPr>
-        <w:t>128.</w:t>
-        <w:tab/>
-      </w:r>
-      <w:r>
-        <w:t xml:space="preserve">UPMC. “Physicians in India access UPMC medical expertise through telemedicine.” EurekAlert!, 21 February 2014. </w:t>
-      </w:r>
-      <w:hyperlink r:id="rId137">
-        <w:r>
-          <w:rPr>
-            <w:color w:val="1F4E99"/>
-          </w:rPr>
-          <w:t xml:space="preserve">https://www.eurekalert.org/news-releases/679748</w:t>
-        </w:r>
-      </w:hyperlink>
-    </w:p>
-    <w:p>
-      <w:pPr>
-        <w:tabs>
-          <w:tab w:pos="567" w:val="left"/>
-        </w:tabs>
-        <w:spacing w:after="120"/>
-        <w:ind w:left="567" w:hanging="567"/>
-      </w:pPr>
-      <w:r>
-        <w:rPr>
-          <w:b/>
-          <w:color w:val="B31822"/>
-        </w:rPr>
-        <w:t>129.</w:t>
-        <w:tab/>
-      </w:r>
-      <w:r>
-        <w:t xml:space="preserve">UPMC International. “Locations and Partnerships.” </w:t>
-      </w:r>
-      <w:hyperlink r:id="rId138">
-        <w:r>
-          <w:rPr>
-            <w:color w:val="1F4E99"/>
-          </w:rPr>
-          <w:t xml:space="preserve">https://www.upmc.com/about/international-services/locations</w:t>
-        </w:r>
-      </w:hyperlink>
-    </w:p>
-    <w:p>
-      <w:pPr>
-        <w:tabs>
-          <w:tab w:pos="567" w:val="left"/>
-        </w:tabs>
-        <w:spacing w:after="120"/>
-        <w:ind w:left="567" w:hanging="567"/>
-      </w:pPr>
-      <w:r>
-        <w:rPr>
-          <w:b/>
-          <w:color w:val="B31822"/>
-        </w:rPr>
-        <w:t>130.</w:t>
-        <w:tab/>
-      </w:r>
-      <w:r>
-        <w:t xml:space="preserve">Harvard Magazine. “At Harvard Medical International, Changes Afoot.” Harvard Magazine, January 2008. </w:t>
-      </w:r>
-      <w:hyperlink r:id="rId139">
-        <w:r>
-          <w:rPr>
-            <w:color w:val="1F4E99"/>
-          </w:rPr>
-          <w:t xml:space="preserve">https://www.harvardmagazine.com/2008/01/harvard-medical</w:t>
-        </w:r>
-      </w:hyperlink>
-    </w:p>
-    <w:p>
-      <w:pPr>
-        <w:tabs>
-          <w:tab w:pos="567" w:val="left"/>
-        </w:tabs>
-        <w:spacing w:after="120"/>
-        <w:ind w:left="567" w:hanging="567"/>
-      </w:pPr>
-      <w:r>
-        <w:rPr>
-          <w:b/>
-          <w:color w:val="B31822"/>
-        </w:rPr>
-        <w:t>131.</w:t>
-        <w:tab/>
-      </w:r>
-      <w:r>
-        <w:t xml:space="preserve">Harvard Gazette. “Partners HealthCare to assume management of Harvard Medical International.” Harvard University, 24 April 2008. </w:t>
-      </w:r>
-      <w:hyperlink r:id="rId140">
-        <w:r>
-          <w:rPr>
-            <w:color w:val="1F4E99"/>
-          </w:rPr>
-          <w:t xml:space="preserve">https://news.harvard.edu/gazette/story/2008/04/partners-healthcare-to-assume-management-of-harvard-medical-international/</w:t>
-        </w:r>
-      </w:hyperlink>
-    </w:p>
-    <w:p>
-      <w:pPr>
-        <w:tabs>
-          <w:tab w:pos="567" w:val="left"/>
-        </w:tabs>
-        <w:spacing w:after="120"/>
-        <w:ind w:left="567" w:hanging="567"/>
-      </w:pPr>
-      <w:r>
-        <w:rPr>
-          <w:b/>
-          <w:color w:val="B31822"/>
-        </w:rPr>
-        <w:t>132.</w:t>
-        <w:tab/>
-      </w:r>
-      <w:r>
-        <w:t xml:space="preserve">WBUR News. “Brand-Aid: Hospital Giant Partners HealthCare Is Changing Names.” WBUR, 27 November 2019. </w:t>
-      </w:r>
-      <w:hyperlink r:id="rId141">
-        <w:r>
-          <w:rPr>
-            <w:color w:val="1F4E99"/>
-          </w:rPr>
-          <w:t xml:space="preserve">https://www.wbur.org/news/2019/11/27/partners-mass-general-brigham-hospitals</w:t>
-        </w:r>
-      </w:hyperlink>
-    </w:p>
-    <w:p>
-      <w:pPr>
-        <w:tabs>
-          <w:tab w:pos="567" w:val="left"/>
-        </w:tabs>
-        <w:spacing w:after="120"/>
-        <w:ind w:left="567" w:hanging="567"/>
-      </w:pPr>
-      <w:r>
-        <w:rPr>
-          <w:b/>
-          <w:color w:val="B31822"/>
-        </w:rPr>
-        <w:t>133.</w:t>
-        <w:tab/>
-      </w:r>
-      <w:r>
-        <w:t xml:space="preserve">Wockhardt Limited. “Annual Report 2010-11.” </w:t>
-      </w:r>
-      <w:hyperlink r:id="rId142">
-        <w:r>
-          <w:rPr>
-            <w:color w:val="1F4E99"/>
-          </w:rPr>
-          <w:t xml:space="preserve">https://www.wockhardt.com/wp-content/uploads/2022/08/annual-report-2010-11-53a4d.pdf</w:t>
-        </w:r>
-      </w:hyperlink>
-    </w:p>
-    <w:p>
-      <w:pPr>
-        <w:tabs>
-          <w:tab w:pos="567" w:val="left"/>
-        </w:tabs>
-        <w:spacing w:after="120"/>
-        <w:ind w:left="567" w:hanging="567"/>
-      </w:pPr>
-      <w:r>
-        <w:rPr>
-          <w:b/>
-          <w:color w:val="B31822"/>
-        </w:rPr>
-        <w:t>134.</w:t>
-        <w:tab/>
-      </w:r>
-      <w:r>
-        <w:t xml:space="preserve">Mass General Brigham. “Global Partnerships.” </w:t>
-      </w:r>
-      <w:hyperlink r:id="rId143">
-        <w:r>
-          <w:rPr>
-            <w:color w:val="1F4E99"/>
-          </w:rPr>
-          <w:t xml:space="preserve">https://www.massgeneralbrigham.org/en/about/members-affiliates/global-partnerships</w:t>
-        </w:r>
-      </w:hyperlink>
-    </w:p>
-    <w:p>
-      <w:pPr>
-        <w:tabs>
-          <w:tab w:pos="567" w:val="left"/>
-        </w:tabs>
-        <w:spacing w:after="120"/>
-        <w:ind w:left="567" w:hanging="567"/>
-      </w:pPr>
-      <w:r>
-        <w:rPr>
-          <w:b/>
-          <w:color w:val="B31822"/>
-        </w:rPr>
-        <w:t>135.</w:t>
-        <w:tab/>
-      </w:r>
-      <w:r>
-        <w:t xml:space="preserve">Houston Methodist. “Houston Methodist Global Health Care Network.” </w:t>
-      </w:r>
-      <w:hyperlink r:id="rId144">
-        <w:r>
-          <w:rPr>
-            <w:color w:val="1F4E99"/>
-          </w:rPr>
-          <w:t xml:space="preserve">https://www.houstonmethodist.org/for-health-professionals/global-health-care-services/affiliations/</w:t>
-        </w:r>
-      </w:hyperlink>
-    </w:p>
-    <w:p>
-      <w:pPr>
-        <w:tabs>
-          <w:tab w:pos="567" w:val="left"/>
-        </w:tabs>
-        <w:spacing w:after="120"/>
-        <w:ind w:left="567" w:hanging="567"/>
-      </w:pPr>
-      <w:r>
-        <w:rPr>
-          <w:b/>
-          <w:color w:val="B31822"/>
-        </w:rPr>
-        <w:t>136.</w:t>
-        <w:tab/>
-      </w:r>
-      <w:r>
-        <w:t xml:space="preserve">Northwestern Medicine Global Services. “Global Healthcare Case Studies &amp; Partnerships.” </w:t>
-      </w:r>
-      <w:hyperlink r:id="rId145">
-        <w:r>
-          <w:rPr>
-            <w:color w:val="1F4E99"/>
-          </w:rPr>
-          <w:t xml:space="preserve">https://www.northwesternglobalservices.com/case-studies.html</w:t>
-        </w:r>
-      </w:hyperlink>
-    </w:p>
-    <w:p>
-      <w:pPr>
-        <w:tabs>
-          <w:tab w:pos="567" w:val="left"/>
-        </w:tabs>
-        <w:spacing w:after="120"/>
-        <w:ind w:left="567" w:hanging="567"/>
-      </w:pPr>
-      <w:r>
-        <w:rPr>
-          <w:b/>
-          <w:color w:val="B31822"/>
-        </w:rPr>
-        <w:t>137.</w:t>
-        <w:tab/>
-      </w:r>
-      <w:r>
         <w:t xml:space="preserve">Medicover. “Medicover divests its India hospital business, enabling accelerated strategy execution in Europe.” Modular Finance via TradingView, 6 August 2026. </w:t>
       </w:r>
-      <w:hyperlink r:id="rId146">
+      <w:hyperlink r:id="rId161">
         <w:r>
           <w:rPr>
             <w:color w:val="1F4E99"/>
@@ -3889,153 +4309,13 @@
           <w:b/>
           <w:color w:val="B31822"/>
         </w:rPr>
-        <w:t>138.</w:t>
+        <w:t>153.</w:t>
         <w:tab/>
       </w:r>
       <w:r>
-        <w:t xml:space="preserve">King's College London. “New partnership to improve healthcare outcomes in India and the UK.” 24 April 2024. </w:t>
-      </w:r>
-      <w:hyperlink r:id="rId147">
-        <w:r>
-          <w:rPr>
-            <w:color w:val="1F4E99"/>
-          </w:rPr>
-          <w:t xml:space="preserve">https://www.kcl.ac.uk/news/new-partnership-to-improve-healthcare-outcomes-in-india-and-the-uk</w:t>
-        </w:r>
-      </w:hyperlink>
-    </w:p>
-    <w:p>
-      <w:pPr>
-        <w:tabs>
-          <w:tab w:pos="567" w:val="left"/>
-        </w:tabs>
-        <w:spacing w:after="120"/>
-        <w:ind w:left="567" w:hanging="567"/>
-      </w:pPr>
-      <w:r>
-        <w:rPr>
-          <w:b/>
-          <w:color w:val="B31822"/>
-        </w:rPr>
-        <w:t>139.</w:t>
-        <w:tab/>
-      </w:r>
-      <w:r>
-        <w:t xml:space="preserve">P. D. Hinduja Hospital. “King's College London and Guy's and St Thomas' NHS Foundation Trust, with P. D. Hinduja Hospital and the Hinduja Foundation establish a Health Partners Academy.” 24 April 2024. </w:t>
-      </w:r>
-      <w:hyperlink r:id="rId148">
-        <w:r>
-          <w:rPr>
-            <w:color w:val="1F4E99"/>
-          </w:rPr>
-          <w:t xml:space="preserve">https://www.hindujahospital.com/press-release/kings-college-london-and-guys-and-st-thomas-nhs-foundation-trust-p-d-hinduja-hospital/</w:t>
-        </w:r>
-      </w:hyperlink>
-    </w:p>
-    <w:p>
-      <w:pPr>
-        <w:tabs>
-          <w:tab w:pos="567" w:val="left"/>
-        </w:tabs>
-        <w:spacing w:after="120"/>
-        <w:ind w:left="567" w:hanging="567"/>
-      </w:pPr>
-      <w:r>
-        <w:rPr>
-          <w:b/>
-          <w:color w:val="B31822"/>
-        </w:rPr>
-        <w:t>140.</w:t>
-        <w:tab/>
-      </w:r>
-      <w:r>
-        <w:t xml:space="preserve">DD News. “West Bengal joins Ayushman Bharat PM-JAY, completing nationwide rollout of world's largest health assurance scheme.” 8 June 2026. </w:t>
-      </w:r>
-      <w:hyperlink r:id="rId149">
-        <w:r>
-          <w:rPr>
-            <w:color w:val="1F4E99"/>
-          </w:rPr>
-          <w:t xml:space="preserve">https://ddnews.gov.in/en/west-bengal-joins-ayushman-bharat-pm-jay-completing-nationwide-rollout-of-worlds-largest-health-assurance-scheme/</w:t>
-        </w:r>
-      </w:hyperlink>
-    </w:p>
-    <w:p>
-      <w:pPr>
-        <w:tabs>
-          <w:tab w:pos="567" w:val="left"/>
-        </w:tabs>
-        <w:spacing w:after="120"/>
-        <w:ind w:left="567" w:hanging="567"/>
-      </w:pPr>
-      <w:r>
-        <w:rPr>
-          <w:b/>
-          <w:color w:val="B31822"/>
-        </w:rPr>
-        <w:t>141.</w:t>
-        <w:tab/>
-      </w:r>
-      <w:r>
-        <w:t xml:space="preserve">Deccan Herald. “Maharashtra signs MoU with Cleveland Clinic-led consortium for $1.2 billion Navi Mumbai MediCity.” 10 June 2026. </w:t>
-      </w:r>
-      <w:hyperlink r:id="rId150">
-        <w:r>
-          <w:rPr>
-            <w:color w:val="1F4E99"/>
-          </w:rPr>
-          <w:t xml:space="preserve">https://www.deccanherald.com/india/maharashtra/maharashtra-signs-mou-with-cleveland-clinic-led-consortium-for-12-billion-navi-mumbai-medicity-4034760</w:t>
-        </w:r>
-      </w:hyperlink>
-    </w:p>
-    <w:p>
-      <w:pPr>
-        <w:tabs>
-          <w:tab w:pos="567" w:val="left"/>
-        </w:tabs>
-        <w:spacing w:after="120"/>
-        <w:ind w:left="567" w:hanging="567"/>
-      </w:pPr>
-      <w:r>
-        <w:rPr>
-          <w:b/>
-          <w:color w:val="B31822"/>
-        </w:rPr>
-        <w:t>142.</w:t>
-        <w:tab/>
-      </w:r>
-      <w:r>
-        <w:t xml:space="preserve">BusinessToday. “Manipal Health Enterprises makes solid stock market debut; shares list at 11% premium.” 5 August 2026. </w:t>
-      </w:r>
-      <w:hyperlink r:id="rId151">
-        <w:r>
-          <w:rPr>
-            <w:color w:val="1F4E99"/>
-          </w:rPr>
-          <w:t xml:space="preserve">https://www.businesstoday.in/markets/stocks/story/manipal-health-enterprises-makes-solid-stock-market-debut-shares-list-at-11-premium-547257-2026-08-05</w:t>
-        </w:r>
-      </w:hyperlink>
-    </w:p>
-    <w:p>
-      <w:pPr>
-        <w:tabs>
-          <w:tab w:pos="567" w:val="left"/>
-        </w:tabs>
-        <w:spacing w:after="120"/>
-        <w:ind w:left="567" w:hanging="567"/>
-      </w:pPr>
-      <w:r>
-        <w:rPr>
-          <w:b/>
-          <w:color w:val="B31822"/>
-        </w:rPr>
-        <w:t>143.</w:t>
-        <w:tab/>
-      </w:r>
-      <w:r>
         <w:t xml:space="preserve">Business Standard. “KKR pumps Rs 13,188 cr into India expansion, acquires Medicover hospitals.” 6 August 2026. </w:t>
       </w:r>
-      <w:hyperlink r:id="rId152">
+      <w:hyperlink r:id="rId162">
         <w:r>
           <w:rPr>
             <w:color w:val="1F4E99"/>
@@ -4057,13 +4337,13 @@
           <w:b/>
           <w:color w:val="B31822"/>
         </w:rPr>
-        <w:t>144.</w:t>
+        <w:t>154.</w:t>
         <w:tab/>
       </w:r>
       <w:r>
         <w:t xml:space="preserve">ANI. “Ayushman Bharat completes 8 years with health cover of Rs 5 lakh to over 12 crore families: NHA CEO.” India Gazette. </w:t>
       </w:r>
-      <w:hyperlink r:id="rId153">
+      <w:hyperlink r:id="rId163">
         <w:r>
           <w:rPr>
             <w:color w:val="1F4E99"/>

</xml_diff>